<commit_message>
12/09/2026 - 18:52 h
</commit_message>
<xml_diff>
--- a/Amor aos inimigos/Amor aos inimigos.docx
+++ b/Amor aos inimigos/Amor aos inimigos.docx
@@ -1880,23 +1880,7 @@
           <w:sz w:val="36"/>
           <w:szCs w:val="36"/>
         </w:rPr>
-        <w:t>Independentemente da origem da expressão, naquele momento Jesus propõe àquelas pessoas uma nova maneira de se relacionarem com seus inimigos, diferente da postura que haviam adotad</w:t>
-      </w:r>
-      <w:r>
-        <w:rPr>
-          <w:rFonts w:ascii="Garamond" w:hAnsi="Garamond"/>
-          <w:sz w:val="36"/>
-          <w:szCs w:val="36"/>
-        </w:rPr>
-        <w:t>a</w:t>
-      </w:r>
-      <w:r>
-        <w:rPr>
-          <w:rFonts w:ascii="Garamond" w:hAnsi="Garamond"/>
-          <w:sz w:val="36"/>
-          <w:szCs w:val="36"/>
-        </w:rPr>
-        <w:t xml:space="preserve"> até então.</w:t>
+        <w:t>Independentemente da origem da expressão, naquele momento Jesus propõe àquelas pessoas uma nova maneira de se relacionarem com seus inimigos, diferente da postura que haviam adotada até então.</w:t>
       </w:r>
       <w:r>
         <w:br w:type="page"/>
@@ -2669,137 +2653,7 @@
           <w:szCs w:val="36"/>
           <w:lang w:val="en-US" w:eastAsia="zh-CN" w:bidi="hi-IN"/>
         </w:rPr>
-        <w:t xml:space="preserve">Afinal de contas, se </w:t>
-      </w:r>
-      <w:r>
-        <w:rPr>
-          <w:rFonts w:eastAsia="Arial" w:cs="Arial" w:ascii="Garamond" w:hAnsi="Garamond"/>
-          <w:i w:val="false"/>
-          <w:iCs w:val="false"/>
-          <w:color w:val="auto"/>
-          <w:kern w:val="0"/>
-          <w:sz w:val="36"/>
-          <w:szCs w:val="36"/>
-          <w:lang w:val="en-US" w:eastAsia="zh-CN" w:bidi="hi-IN"/>
-        </w:rPr>
-        <w:t>eu odeio</w:t>
-      </w:r>
-      <w:r>
-        <w:rPr>
-          <w:rFonts w:eastAsia="Arial" w:cs="Arial" w:ascii="Garamond" w:hAnsi="Garamond"/>
-          <w:i w:val="false"/>
-          <w:iCs w:val="false"/>
-          <w:color w:val="auto"/>
-          <w:kern w:val="0"/>
-          <w:sz w:val="36"/>
-          <w:szCs w:val="36"/>
-          <w:lang w:val="en-US" w:eastAsia="zh-CN" w:bidi="hi-IN"/>
-        </w:rPr>
-        <w:t xml:space="preserve"> os inimigos</w:t>
-      </w:r>
-      <w:r>
-        <w:rPr>
-          <w:rFonts w:eastAsia="Arial" w:cs="Arial" w:ascii="Garamond" w:hAnsi="Garamond"/>
-          <w:i w:val="false"/>
-          <w:iCs w:val="false"/>
-          <w:color w:val="auto"/>
-          <w:kern w:val="0"/>
-          <w:sz w:val="36"/>
-          <w:szCs w:val="36"/>
-          <w:lang w:val="en-US" w:eastAsia="zh-CN" w:bidi="hi-IN"/>
-        </w:rPr>
-        <w:t xml:space="preserve">, </w:t>
-      </w:r>
-      <w:r>
-        <w:rPr>
-          <w:rFonts w:eastAsia="Arial" w:cs="Arial" w:ascii="Garamond" w:hAnsi="Garamond"/>
-          <w:i w:val="false"/>
-          <w:iCs w:val="false"/>
-          <w:color w:val="auto"/>
-          <w:kern w:val="0"/>
-          <w:sz w:val="36"/>
-          <w:szCs w:val="36"/>
-          <w:lang w:val="en-US" w:eastAsia="zh-CN" w:bidi="hi-IN"/>
-        </w:rPr>
-        <w:t>retribu</w:t>
-      </w:r>
-      <w:r>
-        <w:rPr>
-          <w:rFonts w:eastAsia="Arial" w:cs="Arial" w:ascii="Garamond" w:hAnsi="Garamond"/>
-          <w:i w:val="false"/>
-          <w:iCs w:val="false"/>
-          <w:color w:val="auto"/>
-          <w:kern w:val="0"/>
-          <w:sz w:val="36"/>
-          <w:szCs w:val="36"/>
-          <w:lang w:val="en-US" w:eastAsia="zh-CN" w:bidi="hi-IN"/>
-        </w:rPr>
-        <w:t>o</w:t>
-      </w:r>
-      <w:r>
-        <w:rPr>
-          <w:rFonts w:eastAsia="Arial" w:cs="Arial" w:ascii="Garamond" w:hAnsi="Garamond"/>
-          <w:i w:val="false"/>
-          <w:iCs w:val="false"/>
-          <w:color w:val="auto"/>
-          <w:kern w:val="0"/>
-          <w:sz w:val="36"/>
-          <w:szCs w:val="36"/>
-          <w:lang w:val="en-US" w:eastAsia="zh-CN" w:bidi="hi-IN"/>
-        </w:rPr>
-        <w:t xml:space="preserve"> o mal com o próprio mal, </w:t>
-      </w:r>
-      <w:r>
-        <w:rPr>
-          <w:rFonts w:eastAsia="Arial" w:cs="Arial" w:ascii="Garamond" w:hAnsi="Garamond"/>
-          <w:i w:val="false"/>
-          <w:iCs w:val="false"/>
-          <w:color w:val="auto"/>
-          <w:kern w:val="0"/>
-          <w:sz w:val="36"/>
-          <w:szCs w:val="36"/>
-          <w:lang w:val="en-US" w:eastAsia="zh-CN" w:bidi="hi-IN"/>
-        </w:rPr>
-        <w:t xml:space="preserve"> e não perdoo a ninguém, </w:t>
-      </w:r>
-      <w:r>
-        <w:rPr>
-          <w:rFonts w:eastAsia="Arial" w:cs="Arial" w:ascii="Garamond" w:hAnsi="Garamond"/>
-          <w:i w:val="false"/>
-          <w:iCs w:val="false"/>
-          <w:color w:val="auto"/>
-          <w:kern w:val="0"/>
-          <w:sz w:val="36"/>
-          <w:szCs w:val="36"/>
-          <w:lang w:val="en-US" w:eastAsia="zh-CN" w:bidi="hi-IN"/>
-        </w:rPr>
-        <w:t xml:space="preserve">como posso esperar </w:t>
-      </w:r>
-      <w:r>
-        <w:rPr>
-          <w:rFonts w:eastAsia="Arial" w:cs="Arial" w:ascii="Garamond" w:hAnsi="Garamond"/>
-          <w:i w:val="false"/>
-          <w:iCs w:val="false"/>
-          <w:color w:val="auto"/>
-          <w:kern w:val="0"/>
-          <w:sz w:val="36"/>
-          <w:szCs w:val="36"/>
-          <w:lang w:val="en-US" w:eastAsia="zh-CN" w:bidi="hi-IN"/>
-        </w:rPr>
-        <w:t>que Deus me perdoe e seja misericordioso comigo</w:t>
-      </w:r>
-      <w:r>
-        <w:rPr>
-          <w:rFonts w:eastAsia="Arial" w:cs="Arial" w:ascii="Garamond" w:hAnsi="Garamond"/>
-          <w:i w:val="false"/>
-          <w:iCs w:val="false"/>
-          <w:color w:val="auto"/>
-          <w:kern w:val="0"/>
-          <w:sz w:val="36"/>
-          <w:szCs w:val="36"/>
-          <w:lang w:val="en-US" w:eastAsia="zh-CN" w:bidi="hi-IN"/>
-        </w:rPr>
-        <w:t>? Dissemos a pouco: recebemos de acordo com nossas obras.</w:t>
+        <w:t>Afinal de contas, se eu odeio os inimigos, retribuo o mal com o próprio mal,  e não perdoo a ninguém, como posso esperar que Deus me perdoe e seja misericordioso comigo? Dissemos a pouco: recebemos de acordo com nossas obras.</w:t>
       </w:r>
     </w:p>
     <w:p>
@@ -3455,27 +3309,7 @@
           <w:sz w:val="36"/>
           <w:szCs w:val="36"/>
         </w:rPr>
-        <w:t>Mas ele também nos pergunta: o que fazemos mais que os outros? Temos utilizado esse conhecimento apenas como um recurso intelectual</w:t>
-      </w:r>
-      <w:r>
-        <w:rPr>
-          <w:rFonts w:ascii="Garamond" w:hAnsi="Garamond"/>
-          <w:i w:val="false"/>
-          <w:iCs w:val="false"/>
-          <w:sz w:val="36"/>
-          <w:szCs w:val="36"/>
-        </w:rPr>
-        <w:t>, muitas vezes querendo demonstrar superioridade,</w:t>
-      </w:r>
-      <w:r>
-        <w:rPr>
-          <w:rFonts w:ascii="Garamond" w:hAnsi="Garamond"/>
-          <w:i w:val="false"/>
-          <w:iCs w:val="false"/>
-          <w:sz w:val="36"/>
-          <w:szCs w:val="36"/>
-        </w:rPr>
-        <w:t xml:space="preserve"> ou o trazemos no coração, procurando transformá-lo em práticas verdadeiramente cristãs em nossas vidas?</w:t>
+        <w:t>Mas ele também nos pergunta: o que fazemos mais que os outros? Temos utilizado esse conhecimento apenas como um recurso intelectual, muitas vezes querendo demonstrar superioridade, ou o trazemos no coração, procurando transformá-lo em práticas verdadeiramente cristãs em nossas vidas?</w:t>
       </w:r>
     </w:p>
     <w:p>
@@ -3765,19 +3599,7 @@
           <w:shd w:fill="auto" w:val="clear"/>
           <w:lang w:val="en-US" w:eastAsia="zh-CN" w:bidi="hi-IN"/>
         </w:rPr>
-        <w:t>Vamos</w:t>
-      </w:r>
-      <w:r>
-        <w:rPr>
-          <w:rFonts w:eastAsia="Times New Roman" w:cs="Times New Roman" w:ascii="Garamond" w:hAnsi="Garamond"/>
-          <w:color w:val="000000"/>
-          <w:kern w:val="0"/>
-          <w:sz w:val="36"/>
-          <w:szCs w:val="36"/>
-          <w:shd w:fill="auto" w:val="clear"/>
-          <w:lang w:val="en-US" w:eastAsia="zh-CN" w:bidi="hi-IN"/>
-        </w:rPr>
-        <w:t>analisar mais detalhadamente também essa passagem.</w:t>
+        <w:t>Vamosanalisar mais detalhadamente também essa passagem.</w:t>
       </w:r>
     </w:p>
     <w:p>
@@ -4110,7 +3932,10 @@
         </w:rPr>
       </w:pPr>
       <w:r>
-        <w:rPr/>
+        <w:rPr>
+          <w:sz w:val="36"/>
+          <w:szCs w:val="36"/>
+        </w:rPr>
       </w:r>
     </w:p>
     <w:p>
@@ -4257,35 +4082,7 @@
           <w:shd w:fill="auto" w:val="clear"/>
           <w:lang w:val="en-US" w:eastAsia="zh-CN" w:bidi="hi-IN"/>
         </w:rPr>
-        <w:t>Caso contrário, a disputa poderia chegar ao juiz, o devedor poderia ser entregue ao oficial responsável pela execução da decisão e</w:t>
-      </w:r>
-      <w:r>
-        <w:rPr>
-          <w:rFonts w:eastAsia="Times New Roman" w:cs="Times New Roman" w:ascii="Garamond" w:hAnsi="Garamond"/>
-          <w:i w:val="false"/>
-          <w:iCs w:val="false"/>
-          <w:color w:val="000000"/>
-          <w:kern w:val="0"/>
-          <w:sz w:val="36"/>
-          <w:szCs w:val="36"/>
-          <w:shd w:fill="auto" w:val="clear"/>
-          <w:lang w:val="en-US" w:eastAsia="zh-CN" w:bidi="hi-IN"/>
-        </w:rPr>
-        <w:t>, na pior hipótese,</w:t>
-      </w:r>
-      <w:r>
-        <w:rPr>
-          <w:rFonts w:eastAsia="Times New Roman" w:cs="Times New Roman" w:ascii="Garamond" w:hAnsi="Garamond"/>
-          <w:i w:val="false"/>
-          <w:iCs w:val="false"/>
-          <w:color w:val="000000"/>
-          <w:kern w:val="0"/>
-          <w:sz w:val="36"/>
-          <w:szCs w:val="36"/>
-          <w:shd w:fill="auto" w:val="clear"/>
-          <w:lang w:val="en-US" w:eastAsia="zh-CN" w:bidi="hi-IN"/>
-        </w:rPr>
-        <w:t xml:space="preserve"> acabar indo parar na prisão.</w:t>
+        <w:t>Caso contrário, a disputa poderia chegar ao juiz, o devedor poderia ser entregue ao oficial responsável pela execução da decisão e, na pior hipótese, acabar indo parar na prisão.</w:t>
       </w:r>
       <w:r>
         <w:br w:type="page"/>
@@ -4312,21 +4109,7 @@
           <w:shd w:fill="auto" w:val="clear"/>
           <w:lang w:val="en-US" w:eastAsia="zh-CN" w:bidi="hi-IN"/>
         </w:rPr>
-        <w:t>Jesus está nos dizendo</w:t>
-      </w:r>
-      <w:r>
-        <w:rPr>
-          <w:rFonts w:eastAsia="Times New Roman" w:cs="Times New Roman" w:ascii="Garamond" w:hAnsi="Garamond"/>
-          <w:i w:val="false"/>
-          <w:iCs w:val="false"/>
-          <w:color w:val="000000"/>
-          <w:kern w:val="0"/>
-          <w:sz w:val="36"/>
-          <w:szCs w:val="36"/>
-          <w:shd w:fill="auto" w:val="clear"/>
-          <w:lang w:val="en-US" w:eastAsia="zh-CN" w:bidi="hi-IN"/>
-        </w:rPr>
-        <w:t xml:space="preserve">: </w:t>
+        <w:t xml:space="preserve">Jesus está nos dizendo: </w:t>
       </w:r>
       <w:r>
         <w:rPr>
@@ -4340,7 +4123,102 @@
           <w:shd w:fill="auto" w:val="clear"/>
           <w:lang w:val="en-US" w:eastAsia="zh-CN" w:bidi="hi-IN"/>
         </w:rPr>
-        <w:t>"Esforcem-se por acabar com as desavenças entre vocês e seus adversários enquanto podem. Se vocês não o fizerem</w:t>
+        <w:t>"Esforcem-se por acabar com as desavenças entre vocês e seus adversários enquanto podem. Se vocês não o fizerem de boa vontade, a Justiça de Nosso Pai se encarregará de resolvê-las"</w:t>
+      </w:r>
+      <w:r>
+        <w:rPr>
+          <w:rFonts w:eastAsia="Times New Roman" w:cs="Times New Roman" w:ascii="Garamond" w:hAnsi="Garamond"/>
+          <w:i w:val="false"/>
+          <w:iCs w:val="false"/>
+          <w:color w:val="000000"/>
+          <w:kern w:val="0"/>
+          <w:sz w:val="36"/>
+          <w:szCs w:val="36"/>
+          <w:shd w:fill="auto" w:val="clear"/>
+          <w:lang w:val="en-US" w:eastAsia="zh-CN" w:bidi="hi-IN"/>
+        </w:rPr>
+        <w:t>.</w:t>
+      </w:r>
+    </w:p>
+    <w:p>
+      <w:pPr>
+        <w:pStyle w:val="Normal"/>
+        <w:jc w:val="both"/>
+        <w:rPr>
+          <w:sz w:val="36"/>
+          <w:szCs w:val="36"/>
+        </w:rPr>
+      </w:pPr>
+      <w:r>
+        <w:rPr>
+          <w:sz w:val="36"/>
+          <w:szCs w:val="36"/>
+        </w:rPr>
+      </w:r>
+    </w:p>
+    <w:p>
+      <w:pPr>
+        <w:pStyle w:val="Normal"/>
+        <w:jc w:val="both"/>
+        <w:rPr>
+          <w:sz w:val="36"/>
+          <w:szCs w:val="36"/>
+        </w:rPr>
+      </w:pPr>
+      <w:r>
+        <w:rPr>
+          <w:rFonts w:eastAsia="Times New Roman" w:cs="Times New Roman" w:ascii="Garamond" w:hAnsi="Garamond"/>
+          <w:i w:val="false"/>
+          <w:iCs w:val="false"/>
+          <w:color w:val="000000"/>
+          <w:kern w:val="0"/>
+          <w:sz w:val="36"/>
+          <w:szCs w:val="36"/>
+          <w:shd w:fill="auto" w:val="clear"/>
+          <w:lang w:val="en-US" w:eastAsia="zh-CN" w:bidi="hi-IN"/>
+        </w:rPr>
+        <w:t>Entretanto, há um juiz severo e inflexível, ao qual todos nós, sem exceção, estamos submetidos. Questão 261 de O Livro dos Espíritos:</w:t>
+      </w:r>
+    </w:p>
+    <w:p>
+      <w:pPr>
+        <w:pStyle w:val="Normal"/>
+        <w:jc w:val="both"/>
+        <w:rPr>
+          <w:sz w:val="36"/>
+          <w:szCs w:val="36"/>
+        </w:rPr>
+      </w:pPr>
+      <w:r>
+        <w:rPr>
+          <w:sz w:val="36"/>
+          <w:szCs w:val="36"/>
+        </w:rPr>
+      </w:r>
+    </w:p>
+    <w:p>
+      <w:pPr>
+        <w:pStyle w:val="Normal"/>
+        <w:ind w:left="720" w:hanging="0"/>
+        <w:jc w:val="both"/>
+        <w:rPr>
+          <w:sz w:val="36"/>
+          <w:szCs w:val="36"/>
+        </w:rPr>
+      </w:pPr>
+      <w:r>
+        <w:rPr>
+          <w:rFonts w:eastAsia="Times New Roman" w:cs="Times New Roman" w:ascii="Garamond" w:hAnsi="Garamond"/>
+          <w:i w:val="false"/>
+          <w:iCs w:val="false"/>
+          <w:color w:val="000000"/>
+          <w:kern w:val="0"/>
+          <w:sz w:val="36"/>
+          <w:szCs w:val="36"/>
+          <w:shd w:fill="auto" w:val="clear"/>
+          <w:lang w:val="en-US" w:eastAsia="zh-CN" w:bidi="hi-IN"/>
+        </w:rPr>
+        <w:t xml:space="preserve">P - </w:t>
       </w:r>
       <w:r>
         <w:rPr>
@@ -4354,7 +4232,49 @@
           <w:shd w:fill="auto" w:val="clear"/>
           <w:lang w:val="en-US" w:eastAsia="zh-CN" w:bidi="hi-IN"/>
         </w:rPr>
-        <w:t xml:space="preserve"> de boa vontade</w:t>
+        <w:t>Onde está escrita a lei de Deus?</w:t>
+      </w:r>
+    </w:p>
+    <w:p>
+      <w:pPr>
+        <w:pStyle w:val="Normal"/>
+        <w:ind w:left="720" w:hanging="0"/>
+        <w:jc w:val="both"/>
+        <w:rPr>
+          <w:sz w:val="36"/>
+          <w:szCs w:val="36"/>
+        </w:rPr>
+      </w:pPr>
+      <w:r>
+        <w:rPr>
+          <w:sz w:val="36"/>
+          <w:szCs w:val="36"/>
+        </w:rPr>
+      </w:r>
+    </w:p>
+    <w:p>
+      <w:pPr>
+        <w:pStyle w:val="Normal"/>
+        <w:ind w:left="720" w:hanging="0"/>
+        <w:jc w:val="both"/>
+        <w:rPr>
+          <w:sz w:val="36"/>
+          <w:szCs w:val="36"/>
+        </w:rPr>
+      </w:pPr>
+      <w:r>
+        <w:rPr>
+          <w:rFonts w:eastAsia="Times New Roman" w:cs="Times New Roman" w:ascii="Garamond" w:hAnsi="Garamond"/>
+          <w:i w:val="false"/>
+          <w:iCs w:val="false"/>
+          <w:color w:val="000000"/>
+          <w:kern w:val="0"/>
+          <w:sz w:val="36"/>
+          <w:szCs w:val="36"/>
+          <w:shd w:fill="auto" w:val="clear"/>
+          <w:lang w:val="en-US" w:eastAsia="zh-CN" w:bidi="hi-IN"/>
+        </w:rPr>
+        <w:t xml:space="preserve">R - </w:t>
       </w:r>
       <w:r>
         <w:rPr>
@@ -4368,105 +4288,7 @@
           <w:shd w:fill="auto" w:val="clear"/>
           <w:lang w:val="en-US" w:eastAsia="zh-CN" w:bidi="hi-IN"/>
         </w:rPr>
-        <w:t xml:space="preserve">, a Justiça de Nosso Pai </w:t>
-      </w:r>
-      <w:r>
-        <w:rPr>
-          <w:rFonts w:eastAsia="Times New Roman" w:cs="Times New Roman" w:ascii="Garamond" w:hAnsi="Garamond"/>
-          <w:i/>
-          <w:iCs/>
-          <w:color w:val="000000"/>
-          <w:kern w:val="0"/>
-          <w:sz w:val="36"/>
-          <w:szCs w:val="36"/>
-          <w:shd w:fill="auto" w:val="clear"/>
-          <w:lang w:val="en-US" w:eastAsia="zh-CN" w:bidi="hi-IN"/>
-        </w:rPr>
-        <w:t>se encarregará de resolvê-las</w:t>
-      </w:r>
-      <w:r>
-        <w:rPr>
-          <w:rFonts w:eastAsia="Times New Roman" w:cs="Times New Roman" w:ascii="Garamond" w:hAnsi="Garamond"/>
-          <w:i/>
-          <w:iCs/>
-          <w:color w:val="000000"/>
-          <w:kern w:val="0"/>
-          <w:sz w:val="36"/>
-          <w:szCs w:val="36"/>
-          <w:shd w:fill="auto" w:val="clear"/>
-          <w:lang w:val="en-US" w:eastAsia="zh-CN" w:bidi="hi-IN"/>
-        </w:rPr>
-        <w:t>"</w:t>
-      </w:r>
-      <w:r>
-        <w:rPr>
-          <w:rFonts w:eastAsia="Times New Roman" w:cs="Times New Roman" w:ascii="Garamond" w:hAnsi="Garamond"/>
-          <w:i w:val="false"/>
-          <w:iCs w:val="false"/>
-          <w:color w:val="000000"/>
-          <w:kern w:val="0"/>
-          <w:sz w:val="36"/>
-          <w:szCs w:val="36"/>
-          <w:shd w:fill="auto" w:val="clear"/>
-          <w:lang w:val="en-US" w:eastAsia="zh-CN" w:bidi="hi-IN"/>
-        </w:rPr>
-        <w:t>.</w:t>
-      </w:r>
-    </w:p>
-    <w:p>
-      <w:pPr>
-        <w:pStyle w:val="Normal"/>
-        <w:jc w:val="both"/>
-        <w:rPr>
-          <w:sz w:val="36"/>
-          <w:szCs w:val="36"/>
-        </w:rPr>
-      </w:pPr>
-      <w:r>
-        <w:rPr>
-          <w:sz w:val="36"/>
-          <w:szCs w:val="36"/>
-        </w:rPr>
-      </w:r>
-    </w:p>
-    <w:p>
-      <w:pPr>
-        <w:pStyle w:val="Normal"/>
-        <w:jc w:val="both"/>
-        <w:rPr>
-          <w:sz w:val="36"/>
-          <w:szCs w:val="36"/>
-        </w:rPr>
-      </w:pPr>
-      <w:r>
-        <w:rPr>
-          <w:rFonts w:eastAsia="Times New Roman" w:cs="Times New Roman" w:ascii="Garamond" w:hAnsi="Garamond"/>
-          <w:i w:val="false"/>
-          <w:iCs w:val="false"/>
-          <w:color w:val="000000"/>
-          <w:kern w:val="0"/>
-          <w:sz w:val="36"/>
-          <w:szCs w:val="36"/>
-          <w:shd w:fill="auto" w:val="clear"/>
-          <w:lang w:val="en-US" w:eastAsia="zh-CN" w:bidi="hi-IN"/>
-        </w:rPr>
-        <w:t>Entretanto, há um juiz severo e inflexível, ao qual todos nós, sem exceção, estamos submetidos. Questão 261 de O Livro dos Espíritos:</w:t>
-      </w:r>
-    </w:p>
-    <w:p>
-      <w:pPr>
-        <w:pStyle w:val="Normal"/>
-        <w:jc w:val="both"/>
-        <w:rPr>
-          <w:sz w:val="36"/>
-          <w:szCs w:val="36"/>
-        </w:rPr>
-      </w:pPr>
-      <w:r>
-        <w:rPr>
-          <w:sz w:val="36"/>
-          <w:szCs w:val="36"/>
-        </w:rPr>
+        <w:t>Na consciência.</w:t>
       </w:r>
     </w:p>
     <w:p>
@@ -4481,101 +4303,9 @@
       </w:pPr>
       <w:r>
         <w:rPr>
-          <w:rFonts w:eastAsia="Times New Roman" w:cs="Times New Roman" w:ascii="Garamond" w:hAnsi="Garamond"/>
-          <w:i w:val="false"/>
-          <w:iCs w:val="false"/>
-          <w:color w:val="000000"/>
-          <w:kern w:val="0"/>
-          <w:sz w:val="36"/>
-          <w:szCs w:val="36"/>
-          <w:shd w:fill="auto" w:val="clear"/>
-          <w:lang w:val="en-US" w:eastAsia="zh-CN" w:bidi="hi-IN"/>
-        </w:rPr>
-        <w:t xml:space="preserve">P - </w:t>
-      </w:r>
-      <w:r>
-        <w:rPr>
-          <w:rFonts w:eastAsia="Times New Roman" w:cs="Times New Roman" w:ascii="Garamond" w:hAnsi="Garamond"/>
-          <w:i/>
-          <w:iCs/>
-          <w:color w:val="000000"/>
-          <w:kern w:val="0"/>
-          <w:sz w:val="36"/>
-          <w:szCs w:val="36"/>
-          <w:shd w:fill="auto" w:val="clear"/>
-          <w:lang w:val="en-US" w:eastAsia="zh-CN" w:bidi="hi-IN"/>
-        </w:rPr>
-        <w:t>Onde está escrita a lei de Deus?</w:t>
-      </w:r>
-    </w:p>
-    <w:p>
-      <w:pPr>
-        <w:pStyle w:val="Normal"/>
-        <w:ind w:left="720" w:hanging="0"/>
-        <w:jc w:val="both"/>
-        <w:rPr>
-          <w:sz w:val="36"/>
-          <w:szCs w:val="36"/>
-        </w:rPr>
-      </w:pPr>
-      <w:r>
-        <w:rPr>
-          <w:sz w:val="36"/>
-          <w:szCs w:val="36"/>
-        </w:rPr>
-      </w:r>
-    </w:p>
-    <w:p>
-      <w:pPr>
-        <w:pStyle w:val="Normal"/>
-        <w:ind w:left="720" w:hanging="0"/>
-        <w:jc w:val="both"/>
-        <w:rPr>
-          <w:sz w:val="36"/>
-          <w:szCs w:val="36"/>
-        </w:rPr>
-      </w:pPr>
-      <w:r>
-        <w:rPr>
-          <w:rFonts w:eastAsia="Times New Roman" w:cs="Times New Roman" w:ascii="Garamond" w:hAnsi="Garamond"/>
-          <w:i w:val="false"/>
-          <w:iCs w:val="false"/>
-          <w:color w:val="000000"/>
-          <w:kern w:val="0"/>
-          <w:sz w:val="36"/>
-          <w:szCs w:val="36"/>
-          <w:shd w:fill="auto" w:val="clear"/>
-          <w:lang w:val="en-US" w:eastAsia="zh-CN" w:bidi="hi-IN"/>
-        </w:rPr>
-        <w:t xml:space="preserve">R - </w:t>
-      </w:r>
-      <w:r>
-        <w:rPr>
-          <w:rFonts w:eastAsia="Times New Roman" w:cs="Times New Roman" w:ascii="Garamond" w:hAnsi="Garamond"/>
-          <w:i/>
-          <w:iCs/>
-          <w:color w:val="000000"/>
-          <w:kern w:val="0"/>
-          <w:sz w:val="36"/>
-          <w:szCs w:val="36"/>
-          <w:shd w:fill="auto" w:val="clear"/>
-          <w:lang w:val="en-US" w:eastAsia="zh-CN" w:bidi="hi-IN"/>
-        </w:rPr>
-        <w:t>Na consciência.</w:t>
-      </w:r>
-    </w:p>
-    <w:p>
-      <w:pPr>
-        <w:pStyle w:val="Normal"/>
-        <w:ind w:left="720" w:hanging="0"/>
-        <w:jc w:val="both"/>
-        <w:rPr>
-          <w:sz w:val="36"/>
-          <w:szCs w:val="36"/>
-        </w:rPr>
-      </w:pPr>
-      <w:r>
-        <w:rPr/>
+          <w:sz w:val="36"/>
+          <w:szCs w:val="36"/>
+        </w:rPr>
       </w:r>
     </w:p>
     <w:p>
@@ -4705,8 +4435,22 @@
           <w:szCs w:val="36"/>
           <w:lang w:val="en-US" w:eastAsia="zh-CN" w:bidi="hi-IN"/>
         </w:rPr>
-        <w:t xml:space="preserve">Ela surge como aquela voz interior que fala "Eu lhe conheço intimamente e sei que você </w:t>
-      </w:r>
+        <w:t>Ela surge como aquela voz interior que fala "Eu lhe conheço intimamente e sei que você poderia e deveria ter agido de outra maneira". E isso dói porque sabemos que é verdade.</w:t>
+      </w:r>
+    </w:p>
+    <w:p>
+      <w:pPr>
+        <w:pStyle w:val="Normal"/>
+        <w:jc w:val="both"/>
+        <w:rPr>
+          <w:rFonts w:ascii="Garamond" w:hAnsi="Garamond" w:eastAsia="Arial" w:cs="Arial"/>
+          <w:color w:val="auto"/>
+          <w:kern w:val="0"/>
+          <w:sz w:val="36"/>
+          <w:szCs w:val="36"/>
+          <w:lang w:val="en-US" w:eastAsia="zh-CN" w:bidi="hi-IN"/>
+        </w:rPr>
+      </w:pPr>
       <w:r>
         <w:rPr>
           <w:rFonts w:eastAsia="Arial" w:cs="Arial" w:ascii="Garamond" w:hAnsi="Garamond"/>
@@ -4716,8 +4460,21 @@
           <w:szCs w:val="36"/>
           <w:lang w:val="en-US" w:eastAsia="zh-CN" w:bidi="hi-IN"/>
         </w:rPr>
-        <w:t xml:space="preserve">poderia e </w:t>
-      </w:r>
+      </w:r>
+    </w:p>
+    <w:p>
+      <w:pPr>
+        <w:pStyle w:val="Normal"/>
+        <w:jc w:val="both"/>
+        <w:rPr>
+          <w:rFonts w:ascii="Garamond" w:hAnsi="Garamond" w:eastAsia="Arial" w:cs="Arial"/>
+          <w:color w:val="auto"/>
+          <w:kern w:val="0"/>
+          <w:sz w:val="36"/>
+          <w:szCs w:val="36"/>
+          <w:lang w:val="en-US" w:eastAsia="zh-CN" w:bidi="hi-IN"/>
+        </w:rPr>
+      </w:pPr>
       <w:r>
         <w:rPr>
           <w:rFonts w:eastAsia="Arial" w:cs="Arial" w:ascii="Garamond" w:hAnsi="Garamond"/>
@@ -4727,7 +4484,7 @@
           <w:szCs w:val="36"/>
           <w:lang w:val="en-US" w:eastAsia="zh-CN" w:bidi="hi-IN"/>
         </w:rPr>
-        <w:t>deveria ter agido de outra maneira". E isso dói porque sabemos que é verdade.</w:t>
+        <w:t>Mas a consciência pode ser também excelente conselheira e grande amiga. É muito comum que, ao começarmos a colocar em prática os ensinamentos de Jesus, as pessoas nos critiquem e, às vezes, se afastem de nós.</w:t>
       </w:r>
     </w:p>
     <w:p>
@@ -4776,166 +4533,7 @@
           <w:szCs w:val="36"/>
           <w:lang w:val="en-US" w:eastAsia="zh-CN" w:bidi="hi-IN"/>
         </w:rPr>
-        <w:t>Mas a consciência pode ser também excelente conselheira e grande amiga. É muito comum que, ao começarmos a colocar em prática os ensinamentos de Jesus, as pessoas nos critiquem e, às vezes, se afastem de nós.</w:t>
-      </w:r>
-    </w:p>
-    <w:p>
-      <w:pPr>
-        <w:pStyle w:val="Normal"/>
-        <w:jc w:val="both"/>
-        <w:rPr>
-          <w:rFonts w:ascii="Garamond" w:hAnsi="Garamond" w:eastAsia="Arial" w:cs="Arial"/>
-          <w:color w:val="auto"/>
-          <w:kern w:val="0"/>
-          <w:sz w:val="36"/>
-          <w:szCs w:val="36"/>
-          <w:lang w:val="en-US" w:eastAsia="zh-CN" w:bidi="hi-IN"/>
-        </w:rPr>
-      </w:pPr>
-      <w:r>
-        <w:rPr>
-          <w:rFonts w:eastAsia="Arial" w:cs="Arial" w:ascii="Garamond" w:hAnsi="Garamond"/>
-          <w:color w:val="auto"/>
-          <w:kern w:val="0"/>
-          <w:sz w:val="36"/>
-          <w:szCs w:val="36"/>
-          <w:lang w:val="en-US" w:eastAsia="zh-CN" w:bidi="hi-IN"/>
-        </w:rPr>
-      </w:r>
-    </w:p>
-    <w:p>
-      <w:pPr>
-        <w:pStyle w:val="Normal"/>
-        <w:jc w:val="both"/>
-        <w:rPr>
-          <w:rFonts w:ascii="Garamond" w:hAnsi="Garamond" w:eastAsia="Arial" w:cs="Arial"/>
-          <w:color w:val="auto"/>
-          <w:kern w:val="0"/>
-          <w:sz w:val="36"/>
-          <w:szCs w:val="36"/>
-          <w:lang w:val="en-US" w:eastAsia="zh-CN" w:bidi="hi-IN"/>
-        </w:rPr>
-      </w:pPr>
-      <w:r>
-        <w:rPr>
-          <w:rFonts w:eastAsia="Arial" w:cs="Arial" w:ascii="Garamond" w:hAnsi="Garamond"/>
-          <w:color w:val="auto"/>
-          <w:kern w:val="0"/>
-          <w:sz w:val="36"/>
-          <w:szCs w:val="36"/>
-          <w:lang w:val="en-US" w:eastAsia="zh-CN" w:bidi="hi-IN"/>
-        </w:rPr>
-        <w:t>Quando m</w:t>
-      </w:r>
-      <w:r>
-        <w:rPr>
-          <w:rFonts w:eastAsia="Arial" w:cs="Arial" w:ascii="Garamond" w:hAnsi="Garamond"/>
-          <w:color w:val="auto"/>
-          <w:kern w:val="0"/>
-          <w:sz w:val="36"/>
-          <w:szCs w:val="36"/>
-          <w:lang w:val="en-US" w:eastAsia="zh-CN" w:bidi="hi-IN"/>
-        </w:rPr>
-        <w:t>udamos alguns comportamentos</w:t>
-      </w:r>
-      <w:r>
-        <w:rPr>
-          <w:rFonts w:eastAsia="Arial" w:cs="Arial" w:ascii="Garamond" w:hAnsi="Garamond"/>
-          <w:color w:val="auto"/>
-          <w:kern w:val="0"/>
-          <w:sz w:val="36"/>
-          <w:szCs w:val="36"/>
-          <w:lang w:val="en-US" w:eastAsia="zh-CN" w:bidi="hi-IN"/>
-        </w:rPr>
-        <w:t>, abandonamos</w:t>
-      </w:r>
-      <w:r>
-        <w:rPr>
-          <w:rFonts w:eastAsia="Arial" w:cs="Arial" w:ascii="Garamond" w:hAnsi="Garamond"/>
-          <w:color w:val="auto"/>
-          <w:kern w:val="0"/>
-          <w:sz w:val="36"/>
-          <w:szCs w:val="36"/>
-          <w:lang w:val="en-US" w:eastAsia="zh-CN" w:bidi="hi-IN"/>
-        </w:rPr>
-        <w:t xml:space="preserve"> certos hábito</w:t>
-      </w:r>
-      <w:r>
-        <w:rPr>
-          <w:rFonts w:eastAsia="Arial" w:cs="Arial" w:ascii="Garamond" w:hAnsi="Garamond"/>
-          <w:color w:val="auto"/>
-          <w:kern w:val="0"/>
-          <w:sz w:val="36"/>
-          <w:szCs w:val="36"/>
-          <w:lang w:val="en-US" w:eastAsia="zh-CN" w:bidi="hi-IN"/>
-        </w:rPr>
-        <w:t xml:space="preserve">s, muitos </w:t>
-      </w:r>
-      <w:r>
-        <w:rPr>
-          <w:rFonts w:eastAsia="Arial" w:cs="Arial" w:ascii="Garamond" w:hAnsi="Garamond"/>
-          <w:color w:val="auto"/>
-          <w:kern w:val="0"/>
-          <w:sz w:val="36"/>
-          <w:szCs w:val="36"/>
-          <w:lang w:val="en-US" w:eastAsia="zh-CN" w:bidi="hi-IN"/>
-        </w:rPr>
-        <w:t>dizem que nos tornamo</w:t>
-      </w:r>
-      <w:r>
-        <w:rPr>
-          <w:rFonts w:eastAsia="Arial" w:cs="Arial" w:ascii="Garamond" w:hAnsi="Garamond"/>
-          <w:color w:val="auto"/>
-          <w:kern w:val="0"/>
-          <w:sz w:val="36"/>
-          <w:szCs w:val="36"/>
-          <w:lang w:val="en-US" w:eastAsia="zh-CN" w:bidi="hi-IN"/>
-        </w:rPr>
-        <w:t>s</w:t>
-      </w:r>
-      <w:r>
-        <w:rPr>
-          <w:rFonts w:eastAsia="Arial" w:cs="Arial" w:ascii="Garamond" w:hAnsi="Garamond"/>
-          <w:color w:val="auto"/>
-          <w:kern w:val="0"/>
-          <w:sz w:val="36"/>
-          <w:szCs w:val="36"/>
-          <w:lang w:val="en-US" w:eastAsia="zh-CN" w:bidi="hi-IN"/>
-        </w:rPr>
-        <w:t xml:space="preserve"> fanáticos religiosos</w:t>
-      </w:r>
-      <w:r>
-        <w:rPr>
-          <w:rFonts w:eastAsia="Arial" w:cs="Arial" w:ascii="Garamond" w:hAnsi="Garamond"/>
-          <w:color w:val="auto"/>
-          <w:kern w:val="0"/>
-          <w:sz w:val="36"/>
-          <w:szCs w:val="36"/>
-          <w:lang w:val="en-US" w:eastAsia="zh-CN" w:bidi="hi-IN"/>
-        </w:rPr>
-        <w:t xml:space="preserve"> e pessoas sem graça. P</w:t>
-      </w:r>
-      <w:r>
-        <w:rPr>
-          <w:rFonts w:eastAsia="Arial" w:cs="Arial" w:ascii="Garamond" w:hAnsi="Garamond"/>
-          <w:color w:val="auto"/>
-          <w:kern w:val="0"/>
-          <w:sz w:val="36"/>
-          <w:szCs w:val="36"/>
-          <w:lang w:val="en-US" w:eastAsia="zh-CN" w:bidi="hi-IN"/>
-        </w:rPr>
-        <w:t>assam a não querer mais nossa companhia.</w:t>
-      </w:r>
-      <w:r>
-        <w:rPr>
-          <w:rFonts w:eastAsia="Arial" w:cs="Arial" w:ascii="Garamond" w:hAnsi="Garamond"/>
-          <w:color w:val="auto"/>
-          <w:kern w:val="0"/>
-          <w:sz w:val="36"/>
-          <w:szCs w:val="36"/>
-          <w:lang w:val="en-US" w:eastAsia="zh-CN" w:bidi="hi-IN"/>
-        </w:rPr>
-        <w:t xml:space="preserve"> Não tem problema; isso é um direito delas e temos que respeitar.</w:t>
+        <w:t>Quando mudamos alguns comportamentos, abandonamos certos hábitos, muitos dizem que nos tornamos fanáticos religiosos e pessoas sem graça. Passam a não querer mais nossa companhia. Não tem problema; isso é um direito delas e temos que respeitar.</w:t>
       </w:r>
     </w:p>
     <w:p>
@@ -5191,31 +4789,149 @@
         </w:rPr>
       </w:pPr>
       <w:r>
+        <w:rPr>
+          <w:sz w:val="36"/>
+          <w:szCs w:val="36"/>
+        </w:rPr>
+      </w:r>
+    </w:p>
+    <w:p>
+      <w:pPr>
+        <w:pStyle w:val="Normal"/>
+        <w:jc w:val="both"/>
+        <w:rPr>
+          <w:sz w:val="36"/>
+          <w:szCs w:val="36"/>
+        </w:rPr>
+      </w:pPr>
+      <w:r>
+        <w:rPr>
+          <w:rFonts w:eastAsia="Times New Roman" w:cs="Times New Roman" w:ascii="Garamond" w:hAnsi="Garamond"/>
+          <w:i w:val="false"/>
+          <w:iCs w:val="false"/>
+          <w:color w:val="000000"/>
+          <w:kern w:val="0"/>
+          <w:sz w:val="36"/>
+          <w:szCs w:val="36"/>
+          <w:shd w:fill="auto" w:val="clear"/>
+          <w:lang w:val="en-US" w:eastAsia="zh-CN" w:bidi="hi-IN"/>
+        </w:rPr>
+        <w:t>A primeira diz respeito à impossibilidade de ascendermos a mundos mais elevados. Sendo incapazes de perdoar, colocamo-nos na condição daqueles Espíritos que ainda não podem habitar mundos mais elevados.</w:t>
+      </w:r>
+      <w:r>
+        <w:br w:type="page"/>
+      </w:r>
+    </w:p>
+    <w:p>
+      <w:pPr>
+        <w:pStyle w:val="Normal"/>
+        <w:jc w:val="both"/>
         <w:rPr/>
-      </w:r>
-    </w:p>
-    <w:p>
-      <w:pPr>
-        <w:pStyle w:val="Normal"/>
-        <w:jc w:val="both"/>
-        <w:rPr>
-          <w:sz w:val="36"/>
-          <w:szCs w:val="36"/>
-        </w:rPr>
-      </w:pPr>
-      <w:r>
-        <w:rPr>
-          <w:rFonts w:eastAsia="Times New Roman" w:cs="Times New Roman" w:ascii="Garamond" w:hAnsi="Garamond"/>
-          <w:i w:val="false"/>
-          <w:iCs w:val="false"/>
-          <w:color w:val="000000"/>
-          <w:kern w:val="0"/>
-          <w:sz w:val="36"/>
-          <w:szCs w:val="36"/>
-          <w:shd w:fill="auto" w:val="clear"/>
-          <w:lang w:val="en-US" w:eastAsia="zh-CN" w:bidi="hi-IN"/>
-        </w:rPr>
-        <w:t>A primeira diz respeito à impossibilidade de ascendermos a mundos mais elevados. Sendo incapazes de perdoar, colocamo-nos na condição daqueles Espíritos que ainda não podem habitar mundos mais elevados.</w:t>
+      </w:pPr>
+      <w:r>
+        <w:rPr/>
+      </w:r>
+    </w:p>
+    <w:p>
+      <w:pPr>
+        <w:pStyle w:val="Normal"/>
+        <w:jc w:val="both"/>
+        <w:rPr>
+          <w:sz w:val="36"/>
+          <w:szCs w:val="36"/>
+        </w:rPr>
+      </w:pPr>
+      <w:r>
+        <w:rPr>
+          <w:rFonts w:eastAsia="Times New Roman" w:cs="Times New Roman" w:ascii="Garamond" w:hAnsi="Garamond"/>
+          <w:i w:val="false"/>
+          <w:iCs w:val="false"/>
+          <w:color w:val="000000"/>
+          <w:kern w:val="0"/>
+          <w:sz w:val="36"/>
+          <w:szCs w:val="36"/>
+          <w:shd w:fill="auto" w:val="clear"/>
+          <w:lang w:val="en-US" w:eastAsia="zh-CN" w:bidi="hi-IN"/>
+        </w:rPr>
+        <w:t>Essa é uma questão particularmente importante, considerando que a Terra se encontra em sua fase final de transição para mundo de regeneração. Nos últimos anos, temos sido intensamente alertados sobre a necessidade de empreender esforços para que possamos permanecer na Terra regenerada.</w:t>
+      </w:r>
+    </w:p>
+    <w:p>
+      <w:pPr>
+        <w:pStyle w:val="Normal"/>
+        <w:jc w:val="both"/>
+        <w:rPr>
+          <w:sz w:val="36"/>
+          <w:szCs w:val="36"/>
+        </w:rPr>
+      </w:pPr>
+      <w:r>
+        <w:rPr>
+          <w:sz w:val="36"/>
+          <w:szCs w:val="36"/>
+        </w:rPr>
+      </w:r>
+    </w:p>
+    <w:p>
+      <w:pPr>
+        <w:pStyle w:val="Normal"/>
+        <w:jc w:val="both"/>
+        <w:rPr>
+          <w:sz w:val="36"/>
+          <w:szCs w:val="36"/>
+        </w:rPr>
+      </w:pPr>
+      <w:r>
+        <w:rPr>
+          <w:rFonts w:eastAsia="Times New Roman" w:cs="Times New Roman" w:ascii="Garamond" w:hAnsi="Garamond"/>
+          <w:color w:val="000000"/>
+          <w:kern w:val="0"/>
+          <w:sz w:val="36"/>
+          <w:szCs w:val="36"/>
+          <w:shd w:fill="auto" w:val="clear"/>
+          <w:lang w:val="en-US" w:eastAsia="zh-CN" w:bidi="hi-IN"/>
+        </w:rPr>
+        <w:t>Enquanto alimentarmos ódio, desejo de vingança ou qualquer outro sentimento negativo contra aqueles que nos ofenderam, permaneceremos estacionados em faixas vibratórias inferiores, incompatíveis com um mundo regenerado.</w:t>
+      </w:r>
+    </w:p>
+    <w:p>
+      <w:pPr>
+        <w:pStyle w:val="Normal"/>
+        <w:jc w:val="both"/>
+        <w:rPr>
+          <w:sz w:val="36"/>
+          <w:szCs w:val="36"/>
+        </w:rPr>
+      </w:pPr>
+      <w:r>
+        <w:rPr>
+          <w:sz w:val="36"/>
+          <w:szCs w:val="36"/>
+        </w:rPr>
+      </w:r>
+    </w:p>
+    <w:p>
+      <w:pPr>
+        <w:pStyle w:val="Normal"/>
+        <w:jc w:val="both"/>
+        <w:rPr>
+          <w:sz w:val="36"/>
+          <w:szCs w:val="36"/>
+        </w:rPr>
+      </w:pPr>
+      <w:r>
+        <w:rPr>
+          <w:rFonts w:eastAsia="Times New Roman" w:cs="Times New Roman" w:ascii="Garamond" w:hAnsi="Garamond"/>
+          <w:i w:val="false"/>
+          <w:iCs w:val="false"/>
+          <w:color w:val="000000"/>
+          <w:kern w:val="0"/>
+          <w:sz w:val="36"/>
+          <w:szCs w:val="36"/>
+          <w:shd w:fill="auto" w:val="clear"/>
+          <w:lang w:val="en-US" w:eastAsia="zh-CN" w:bidi="hi-IN"/>
+        </w:rPr>
+        <w:t>A segunda interpretação da prisão mencionada por Jesus refere-se ao nosso estado de consciência. A Doutrina Espírita também nos explica que céu e inferno não são lugares físicos de felicidade ou sofrimento eternos, mas estados da consciência do Espírito, que sofre ou se sente feliz como consequência de suas próprias ações.</w:t>
       </w:r>
       <w:r>
         <w:br w:type="page"/>
@@ -5225,425 +4941,792 @@
       <w:pPr>
         <w:pStyle w:val="Normal"/>
         <w:jc w:val="both"/>
+        <w:rPr>
+          <w:sz w:val="36"/>
+          <w:szCs w:val="36"/>
+        </w:rPr>
+      </w:pPr>
+      <w:r>
+        <w:rPr>
+          <w:rFonts w:eastAsia="Times New Roman" w:cs="Times New Roman" w:ascii="Garamond" w:hAnsi="Garamond"/>
+          <w:i w:val="false"/>
+          <w:iCs w:val="false"/>
+          <w:color w:val="000000"/>
+          <w:kern w:val="0"/>
+          <w:sz w:val="36"/>
+          <w:szCs w:val="36"/>
+          <w:shd w:fill="auto" w:val="clear"/>
+          <w:lang w:val="en-US" w:eastAsia="zh-CN" w:bidi="hi-IN"/>
+        </w:rPr>
+        <w:t>O mesmo acontece com essa prisão da qual Jesus fala. Temos diversos exemplos na literatura espírita de irmãos que permanecem presos ao ódio ou ao desejo de vingança. Eles não conseguem se desvencilhar dessas ideias, permanecendo vinculados a elas durante anos, décadas e, às vezes, séculos.</w:t>
+      </w:r>
+    </w:p>
+    <w:p>
+      <w:pPr>
+        <w:pStyle w:val="Normal"/>
+        <w:jc w:val="both"/>
+        <w:rPr>
+          <w:sz w:val="36"/>
+          <w:szCs w:val="36"/>
+        </w:rPr>
+      </w:pPr>
+      <w:r>
+        <w:rPr>
+          <w:sz w:val="36"/>
+          <w:szCs w:val="36"/>
+        </w:rPr>
+      </w:r>
+    </w:p>
+    <w:p>
+      <w:pPr>
+        <w:pStyle w:val="Normal"/>
+        <w:jc w:val="both"/>
+        <w:rPr>
+          <w:sz w:val="36"/>
+          <w:szCs w:val="36"/>
+        </w:rPr>
+      </w:pPr>
+      <w:r>
+        <w:rPr>
+          <w:rFonts w:eastAsia="Times New Roman" w:cs="Times New Roman" w:ascii="Garamond" w:hAnsi="Garamond"/>
+          <w:i w:val="false"/>
+          <w:iCs w:val="false"/>
+          <w:color w:val="000000"/>
+          <w:kern w:val="0"/>
+          <w:sz w:val="36"/>
+          <w:szCs w:val="36"/>
+          <w:shd w:fill="auto" w:val="clear"/>
+          <w:lang w:val="en-US" w:eastAsia="zh-CN" w:bidi="hi-IN"/>
+        </w:rPr>
+        <w:t xml:space="preserve">Isso pode soar como algo inimaginável, mas não é. Querem um exemplo? Quase todos nós já passamos por alguma ocasião na vida em que somos tomados por uma preocupação incontrolável. </w:t>
+      </w:r>
+    </w:p>
+    <w:p>
+      <w:pPr>
+        <w:pStyle w:val="Normal"/>
+        <w:jc w:val="both"/>
+        <w:rPr>
+          <w:sz w:val="36"/>
+          <w:szCs w:val="36"/>
+        </w:rPr>
+      </w:pPr>
+      <w:r>
+        <w:rPr>
+          <w:sz w:val="36"/>
+          <w:szCs w:val="36"/>
+        </w:rPr>
+      </w:r>
+    </w:p>
+    <w:p>
+      <w:pPr>
+        <w:pStyle w:val="Normal"/>
+        <w:jc w:val="both"/>
+        <w:rPr>
+          <w:sz w:val="36"/>
+          <w:szCs w:val="36"/>
+        </w:rPr>
+      </w:pPr>
+      <w:r>
+        <w:rPr>
+          <w:rFonts w:eastAsia="Times New Roman" w:cs="Times New Roman" w:ascii="Garamond" w:hAnsi="Garamond"/>
+          <w:i w:val="false"/>
+          <w:iCs w:val="false"/>
+          <w:color w:val="000000"/>
+          <w:kern w:val="0"/>
+          <w:sz w:val="36"/>
+          <w:szCs w:val="36"/>
+          <w:shd w:fill="auto" w:val="clear"/>
+          <w:lang w:val="en-US" w:eastAsia="zh-CN" w:bidi="hi-IN"/>
+        </w:rPr>
+        <w:t>As causas são as mais variadas: o diagnóstico de uma doença grave, alguém que amamos passando por grande dificuldade ou até mesmo um problema de ordem financeira.</w:t>
+      </w:r>
+    </w:p>
+    <w:p>
+      <w:pPr>
+        <w:pStyle w:val="Normal"/>
+        <w:jc w:val="both"/>
+        <w:rPr>
+          <w:sz w:val="36"/>
+          <w:szCs w:val="36"/>
+        </w:rPr>
+      </w:pPr>
+      <w:r>
+        <w:rPr>
+          <w:sz w:val="36"/>
+          <w:szCs w:val="36"/>
+        </w:rPr>
+      </w:r>
+    </w:p>
+    <w:p>
+      <w:pPr>
+        <w:pStyle w:val="Normal"/>
+        <w:jc w:val="both"/>
+        <w:rPr>
+          <w:sz w:val="36"/>
+          <w:szCs w:val="36"/>
+        </w:rPr>
+      </w:pPr>
+      <w:r>
+        <w:rPr>
+          <w:rFonts w:eastAsia="Times New Roman" w:cs="Times New Roman" w:ascii="Garamond" w:hAnsi="Garamond"/>
+          <w:i w:val="false"/>
+          <w:iCs w:val="false"/>
+          <w:color w:val="000000"/>
+          <w:kern w:val="0"/>
+          <w:sz w:val="36"/>
+          <w:szCs w:val="36"/>
+          <w:shd w:fill="auto" w:val="clear"/>
+          <w:lang w:val="en-US" w:eastAsia="zh-CN" w:bidi="hi-IN"/>
+        </w:rPr>
+        <w:t>Em momentos assim, aquela preocupação domina nossa mente e nosso coração de tal forma, que somos incapazes de esquecê-la.</w:t>
+      </w:r>
+      <w:r>
+        <w:br w:type="page"/>
+      </w:r>
+    </w:p>
+    <w:p>
+      <w:pPr>
+        <w:pStyle w:val="Normal"/>
+        <w:jc w:val="both"/>
+        <w:rPr>
+          <w:sz w:val="36"/>
+          <w:szCs w:val="36"/>
+        </w:rPr>
+      </w:pPr>
+      <w:r>
+        <w:rPr>
+          <w:rFonts w:eastAsia="Times New Roman" w:cs="Times New Roman" w:ascii="Garamond" w:hAnsi="Garamond"/>
+          <w:i w:val="false"/>
+          <w:iCs w:val="false"/>
+          <w:color w:val="000000"/>
+          <w:kern w:val="0"/>
+          <w:sz w:val="36"/>
+          <w:szCs w:val="36"/>
+          <w:shd w:fill="auto" w:val="clear"/>
+          <w:lang w:val="en-US" w:eastAsia="zh-CN" w:bidi="hi-IN"/>
+        </w:rPr>
+        <w:t>Às vezes não conseguimos nem mesmo orar para pedir ajuda. Começamos nossa oração, a preocupação vem e toma conta de nós. Geralmente precisamos de ajuda externa para sairmos dessa condição.</w:t>
+      </w:r>
+    </w:p>
+    <w:p>
+      <w:pPr>
+        <w:pStyle w:val="Normal"/>
+        <w:jc w:val="both"/>
+        <w:rPr>
+          <w:sz w:val="36"/>
+          <w:szCs w:val="36"/>
+        </w:rPr>
+      </w:pPr>
+      <w:r>
+        <w:rPr>
+          <w:sz w:val="36"/>
+          <w:szCs w:val="36"/>
+        </w:rPr>
+      </w:r>
+    </w:p>
+    <w:p>
+      <w:pPr>
+        <w:pStyle w:val="Normal"/>
+        <w:jc w:val="both"/>
+        <w:rPr>
+          <w:sz w:val="36"/>
+          <w:szCs w:val="36"/>
+        </w:rPr>
+      </w:pPr>
+      <w:r>
+        <w:rPr>
+          <w:rFonts w:eastAsia="Times New Roman" w:cs="Times New Roman" w:ascii="Garamond" w:hAnsi="Garamond"/>
+          <w:i w:val="false"/>
+          <w:iCs w:val="false"/>
+          <w:color w:val="000000"/>
+          <w:kern w:val="0"/>
+          <w:sz w:val="36"/>
+          <w:szCs w:val="36"/>
+          <w:shd w:fill="auto" w:val="clear"/>
+          <w:lang w:val="en-US" w:eastAsia="zh-CN" w:bidi="hi-IN"/>
+        </w:rPr>
+        <w:t>Se somos dominados dessa maneira por uma preocupação legítima, imaginem trazer o coração e a mente transbordando de ódio e desejo de vingança, sobretudo depois de desencarnado.</w:t>
+      </w:r>
+    </w:p>
+    <w:p>
+      <w:pPr>
+        <w:pStyle w:val="Normal"/>
+        <w:jc w:val="both"/>
+        <w:rPr>
+          <w:sz w:val="36"/>
+          <w:szCs w:val="36"/>
+        </w:rPr>
+      </w:pPr>
+      <w:r>
+        <w:rPr>
+          <w:sz w:val="36"/>
+          <w:szCs w:val="36"/>
+        </w:rPr>
+      </w:r>
+    </w:p>
+    <w:p>
+      <w:pPr>
+        <w:pStyle w:val="Normal"/>
+        <w:jc w:val="both"/>
+        <w:rPr>
+          <w:sz w:val="36"/>
+          <w:szCs w:val="36"/>
+        </w:rPr>
+      </w:pPr>
+      <w:r>
+        <w:rPr>
+          <w:rFonts w:eastAsia="Times New Roman" w:cs="Times New Roman" w:ascii="Garamond" w:hAnsi="Garamond"/>
+          <w:i w:val="false"/>
+          <w:iCs w:val="false"/>
+          <w:color w:val="000000"/>
+          <w:kern w:val="0"/>
+          <w:sz w:val="36"/>
+          <w:szCs w:val="36"/>
+          <w:shd w:fill="auto" w:val="clear"/>
+          <w:lang w:val="en-US" w:eastAsia="zh-CN" w:bidi="hi-IN"/>
+        </w:rPr>
+        <w:t>O ódio aprisiona o Espírito que o alimenta contra quem lhe fez mal, e se o sentimento for recíproco, os dois acabam presos na mesma situação, criando uma cadeia de sofrimento que parece não ter fim.</w:t>
+      </w:r>
+    </w:p>
+    <w:p>
+      <w:pPr>
+        <w:pStyle w:val="Normal"/>
+        <w:jc w:val="both"/>
+        <w:rPr>
+          <w:rFonts w:ascii="Garamond" w:hAnsi="Garamond" w:eastAsia="Times New Roman" w:cs="Times New Roman"/>
+          <w:i w:val="false"/>
+          <w:i w:val="false"/>
+          <w:iCs w:val="false"/>
+          <w:color w:val="000000"/>
+          <w:kern w:val="0"/>
+          <w:sz w:val="36"/>
+          <w:szCs w:val="36"/>
+          <w:shd w:fill="auto" w:val="clear"/>
+          <w:lang w:val="en-US" w:eastAsia="zh-CN" w:bidi="hi-IN"/>
+        </w:rPr>
+      </w:pPr>
+      <w:r>
+        <w:rPr>
+          <w:rFonts w:eastAsia="Times New Roman" w:cs="Times New Roman" w:ascii="Garamond" w:hAnsi="Garamond"/>
+          <w:i w:val="false"/>
+          <w:iCs w:val="false"/>
+          <w:color w:val="000000"/>
+          <w:kern w:val="0"/>
+          <w:sz w:val="36"/>
+          <w:szCs w:val="36"/>
+          <w:shd w:fill="auto" w:val="clear"/>
+          <w:lang w:val="en-US" w:eastAsia="zh-CN" w:bidi="hi-IN"/>
+        </w:rPr>
+      </w:r>
+    </w:p>
+    <w:p>
+      <w:pPr>
+        <w:pStyle w:val="Normal"/>
+        <w:jc w:val="both"/>
+        <w:rPr>
+          <w:rFonts w:ascii="Garamond" w:hAnsi="Garamond" w:eastAsia="Times New Roman" w:cs="Times New Roman"/>
+          <w:i w:val="false"/>
+          <w:i w:val="false"/>
+          <w:iCs w:val="false"/>
+          <w:color w:val="000000"/>
+          <w:kern w:val="0"/>
+          <w:sz w:val="36"/>
+          <w:szCs w:val="36"/>
+          <w:shd w:fill="auto" w:val="clear"/>
+          <w:lang w:val="en-US" w:eastAsia="zh-CN" w:bidi="hi-IN"/>
+        </w:rPr>
+      </w:pPr>
+      <w:r>
+        <w:rPr>
+          <w:rFonts w:eastAsia="Times New Roman" w:cs="Times New Roman" w:ascii="Garamond" w:hAnsi="Garamond"/>
+          <w:i w:val="false"/>
+          <w:iCs w:val="false"/>
+          <w:color w:val="000000"/>
+          <w:kern w:val="0"/>
+          <w:sz w:val="36"/>
+          <w:szCs w:val="36"/>
+          <w:shd w:fill="auto" w:val="clear"/>
+          <w:lang w:val="en-US" w:eastAsia="zh-CN" w:bidi="hi-IN"/>
+        </w:rPr>
+        <w:t>Esse é o inferno do qual falamos a pouco. Um estado de consciência escravizador. É como se o Espírito estivesse acorrentado àquela ideia. E assim ele vai permanecer até que compreenda o quanto aquilo é prejudicial a ele e aos outros.</w:t>
+      </w:r>
+      <w:r>
+        <w:br w:type="page"/>
+      </w:r>
+    </w:p>
+    <w:p>
+      <w:pPr>
+        <w:pStyle w:val="Normal"/>
+        <w:jc w:val="both"/>
+        <w:rPr>
+          <w:rFonts w:ascii="Garamond" w:hAnsi="Garamond" w:eastAsia="Times New Roman" w:cs="Times New Roman"/>
+          <w:i w:val="false"/>
+          <w:i w:val="false"/>
+          <w:iCs w:val="false"/>
+          <w:color w:val="000000"/>
+          <w:kern w:val="0"/>
+          <w:sz w:val="36"/>
+          <w:szCs w:val="36"/>
+          <w:shd w:fill="auto" w:val="clear"/>
+          <w:lang w:val="en-US" w:eastAsia="zh-CN" w:bidi="hi-IN"/>
+        </w:rPr>
+      </w:pPr>
+      <w:r>
+        <w:rPr>
+          <w:rFonts w:eastAsia="Times New Roman" w:cs="Times New Roman" w:ascii="Garamond" w:hAnsi="Garamond"/>
+          <w:i w:val="false"/>
+          <w:iCs w:val="false"/>
+          <w:color w:val="000000"/>
+          <w:kern w:val="0"/>
+          <w:sz w:val="36"/>
+          <w:szCs w:val="36"/>
+          <w:shd w:fill="auto" w:val="clear"/>
+          <w:lang w:val="en-US" w:eastAsia="zh-CN" w:bidi="hi-IN"/>
+        </w:rPr>
+        <w:t>Lembram-se de Nosso Lar? Em que momento Clarêncio conseguiu resgatar André Luiz do Umbral? Apenas quando André, exaurido pela condição em que se encontrava, finalmente eleva um pensamento a Deus e ora. Naquele momento, ele finalmente se permite ser auxiliado e Clarêncio, que já estava pronto há muito tempo para socorrer André Luiz, consegue resgatá-lo.</w:t>
+      </w:r>
+    </w:p>
+    <w:p>
+      <w:pPr>
+        <w:pStyle w:val="Normal"/>
+        <w:jc w:val="both"/>
+        <w:rPr>
+          <w:rFonts w:ascii="Garamond" w:hAnsi="Garamond" w:eastAsia="Times New Roman" w:cs="Times New Roman"/>
+          <w:i w:val="false"/>
+          <w:i w:val="false"/>
+          <w:iCs w:val="false"/>
+          <w:color w:val="000000"/>
+          <w:kern w:val="0"/>
+          <w:sz w:val="36"/>
+          <w:szCs w:val="36"/>
+          <w:shd w:fill="auto" w:val="clear"/>
+          <w:lang w:val="en-US" w:eastAsia="zh-CN" w:bidi="hi-IN"/>
+        </w:rPr>
+      </w:pPr>
+      <w:r>
+        <w:rPr>
+          <w:rFonts w:eastAsia="Times New Roman" w:cs="Times New Roman" w:ascii="Garamond" w:hAnsi="Garamond"/>
+          <w:i w:val="false"/>
+          <w:iCs w:val="false"/>
+          <w:color w:val="000000"/>
+          <w:kern w:val="0"/>
+          <w:sz w:val="36"/>
+          <w:szCs w:val="36"/>
+          <w:shd w:fill="auto" w:val="clear"/>
+          <w:lang w:val="en-US" w:eastAsia="zh-CN" w:bidi="hi-IN"/>
+        </w:rPr>
+      </w:r>
+    </w:p>
+    <w:p>
+      <w:pPr>
+        <w:pStyle w:val="Normal"/>
+        <w:jc w:val="both"/>
+        <w:rPr>
+          <w:rFonts w:ascii="Garamond" w:hAnsi="Garamond" w:eastAsia="Times New Roman" w:cs="Times New Roman"/>
+          <w:i w:val="false"/>
+          <w:i w:val="false"/>
+          <w:iCs w:val="false"/>
+          <w:color w:val="000000"/>
+          <w:kern w:val="0"/>
+          <w:sz w:val="36"/>
+          <w:szCs w:val="36"/>
+          <w:shd w:fill="auto" w:val="clear"/>
+          <w:lang w:val="en-US" w:eastAsia="zh-CN" w:bidi="hi-IN"/>
+        </w:rPr>
+      </w:pPr>
+      <w:r>
+        <w:rPr>
+          <w:rFonts w:eastAsia="Times New Roman" w:cs="Times New Roman" w:ascii="Garamond" w:hAnsi="Garamond"/>
+          <w:i w:val="false"/>
+          <w:iCs w:val="false"/>
+          <w:color w:val="000000"/>
+          <w:kern w:val="0"/>
+          <w:sz w:val="36"/>
+          <w:szCs w:val="36"/>
+          <w:shd w:fill="auto" w:val="clear"/>
+          <w:lang w:val="en-US" w:eastAsia="zh-CN" w:bidi="hi-IN"/>
+        </w:rPr>
+        <w:t>Deus, Jesus Cristo, nosso anjo de guarda e a Espiritualidade sempre vão respeitar nosso livre arbítrio. Ninguém fará nada por nós enquanto não nos permitirmos ser auxiliados.</w:t>
+      </w:r>
+    </w:p>
+    <w:p>
+      <w:pPr>
+        <w:pStyle w:val="Normal"/>
+        <w:jc w:val="both"/>
+        <w:rPr>
+          <w:rFonts w:ascii="Garamond" w:hAnsi="Garamond" w:eastAsia="Times New Roman" w:cs="Times New Roman"/>
+          <w:i w:val="false"/>
+          <w:i w:val="false"/>
+          <w:iCs w:val="false"/>
+          <w:color w:val="000000"/>
+          <w:kern w:val="0"/>
+          <w:sz w:val="36"/>
+          <w:szCs w:val="36"/>
+          <w:shd w:fill="auto" w:val="clear"/>
+          <w:lang w:val="en-US" w:eastAsia="zh-CN" w:bidi="hi-IN"/>
+        </w:rPr>
+      </w:pPr>
+      <w:r>
+        <w:rPr>
+          <w:rFonts w:eastAsia="Times New Roman" w:cs="Times New Roman" w:ascii="Garamond" w:hAnsi="Garamond"/>
+          <w:i w:val="false"/>
+          <w:iCs w:val="false"/>
+          <w:color w:val="000000"/>
+          <w:kern w:val="0"/>
+          <w:sz w:val="36"/>
+          <w:szCs w:val="36"/>
+          <w:shd w:fill="auto" w:val="clear"/>
+          <w:lang w:val="en-US" w:eastAsia="zh-CN" w:bidi="hi-IN"/>
+        </w:rPr>
+      </w:r>
+    </w:p>
+    <w:p>
+      <w:pPr>
+        <w:pStyle w:val="Normal"/>
+        <w:jc w:val="both"/>
+        <w:rPr>
+          <w:rFonts w:ascii="Garamond" w:hAnsi="Garamond" w:eastAsia="Times New Roman" w:cs="Times New Roman"/>
+          <w:i w:val="false"/>
+          <w:i w:val="false"/>
+          <w:iCs w:val="false"/>
+          <w:color w:val="000000"/>
+          <w:kern w:val="0"/>
+          <w:sz w:val="36"/>
+          <w:szCs w:val="36"/>
+          <w:shd w:fill="auto" w:val="clear"/>
+          <w:lang w:val="en-US" w:eastAsia="zh-CN" w:bidi="hi-IN"/>
+        </w:rPr>
+      </w:pPr>
+      <w:r>
+        <w:rPr>
+          <w:rFonts w:eastAsia="Times New Roman" w:cs="Times New Roman" w:ascii="Garamond" w:hAnsi="Garamond"/>
+          <w:i w:val="false"/>
+          <w:iCs w:val="false"/>
+          <w:color w:val="000000"/>
+          <w:kern w:val="0"/>
+          <w:sz w:val="36"/>
+          <w:szCs w:val="36"/>
+          <w:shd w:fill="auto" w:val="clear"/>
+          <w:lang w:val="en-US" w:eastAsia="zh-CN" w:bidi="hi-IN"/>
+        </w:rPr>
+        <w:t>Quando falamos em perdão, sempre surge a seguinte dúvida: o que acontece se eu perdoar a pessoa, mas ela não me perdoar? Bem, se eu consigo superar o ódio, o ressentimento e o desejo de vingança, então eu começo a romper os laços estabelecidos pelo ódio.</w:t>
+      </w:r>
+      <w:r>
+        <w:br w:type="page"/>
+      </w:r>
+    </w:p>
+    <w:p>
+      <w:pPr>
+        <w:pStyle w:val="Normal"/>
+        <w:jc w:val="both"/>
+        <w:rPr>
+          <w:rFonts w:ascii="Garamond" w:hAnsi="Garamond" w:eastAsia="Times New Roman" w:cs="Times New Roman"/>
+          <w:i w:val="false"/>
+          <w:i w:val="false"/>
+          <w:iCs w:val="false"/>
+          <w:color w:val="000000"/>
+          <w:kern w:val="0"/>
+          <w:sz w:val="36"/>
+          <w:szCs w:val="36"/>
+          <w:shd w:fill="auto" w:val="clear"/>
+          <w:lang w:val="en-US" w:eastAsia="zh-CN" w:bidi="hi-IN"/>
+        </w:rPr>
+      </w:pPr>
+      <w:r>
+        <w:rPr>
+          <w:rFonts w:eastAsia="Times New Roman" w:cs="Times New Roman" w:ascii="Garamond" w:hAnsi="Garamond"/>
+          <w:i w:val="false"/>
+          <w:iCs w:val="false"/>
+          <w:color w:val="000000"/>
+          <w:kern w:val="0"/>
+          <w:sz w:val="36"/>
+          <w:szCs w:val="36"/>
+          <w:shd w:fill="auto" w:val="clear"/>
+          <w:lang w:val="en-US" w:eastAsia="zh-CN" w:bidi="hi-IN"/>
+        </w:rPr>
+        <w:t xml:space="preserve">Contudo, há algo que precisa ficar muito claro: o fato de eu perdoar alguém com quem estabeleci vínculos de ódio, não me isenta de responsabilidade de reparar erros que eu porventura tenha cometido contra aquela pessoa. </w:t>
+      </w:r>
+    </w:p>
+    <w:p>
+      <w:pPr>
+        <w:pStyle w:val="Normal"/>
+        <w:jc w:val="both"/>
+        <w:rPr>
+          <w:rFonts w:ascii="Garamond" w:hAnsi="Garamond" w:eastAsia="Times New Roman" w:cs="Times New Roman"/>
+          <w:i w:val="false"/>
+          <w:i w:val="false"/>
+          <w:iCs w:val="false"/>
+          <w:color w:val="000000"/>
+          <w:kern w:val="0"/>
+          <w:sz w:val="36"/>
+          <w:szCs w:val="36"/>
+          <w:shd w:fill="auto" w:val="clear"/>
+          <w:lang w:val="en-US" w:eastAsia="zh-CN" w:bidi="hi-IN"/>
+        </w:rPr>
+      </w:pPr>
+      <w:r>
+        <w:rPr>
+          <w:rFonts w:eastAsia="Times New Roman" w:cs="Times New Roman" w:ascii="Garamond" w:hAnsi="Garamond"/>
+          <w:i w:val="false"/>
+          <w:iCs w:val="false"/>
+          <w:color w:val="000000"/>
+          <w:kern w:val="0"/>
+          <w:sz w:val="36"/>
+          <w:szCs w:val="36"/>
+          <w:shd w:fill="auto" w:val="clear"/>
+          <w:lang w:val="en-US" w:eastAsia="zh-CN" w:bidi="hi-IN"/>
+        </w:rPr>
+      </w:r>
+    </w:p>
+    <w:p>
+      <w:pPr>
+        <w:pStyle w:val="Normal"/>
+        <w:jc w:val="both"/>
+        <w:rPr>
+          <w:rFonts w:ascii="Garamond" w:hAnsi="Garamond" w:eastAsia="Times New Roman" w:cs="Times New Roman"/>
+          <w:i w:val="false"/>
+          <w:i w:val="false"/>
+          <w:iCs w:val="false"/>
+          <w:color w:val="000000"/>
+          <w:kern w:val="0"/>
+          <w:sz w:val="36"/>
+          <w:szCs w:val="36"/>
+          <w:shd w:fill="auto" w:val="clear"/>
+          <w:lang w:val="en-US" w:eastAsia="zh-CN" w:bidi="hi-IN"/>
+        </w:rPr>
+      </w:pPr>
+      <w:r>
+        <w:rPr>
+          <w:rFonts w:eastAsia="Times New Roman" w:cs="Times New Roman" w:ascii="Garamond" w:hAnsi="Garamond"/>
+          <w:i w:val="false"/>
+          <w:iCs w:val="false"/>
+          <w:color w:val="000000"/>
+          <w:kern w:val="0"/>
+          <w:sz w:val="36"/>
+          <w:szCs w:val="36"/>
+          <w:shd w:fill="auto" w:val="clear"/>
+          <w:lang w:val="en-US" w:eastAsia="zh-CN" w:bidi="hi-IN"/>
+        </w:rPr>
+        <w:t>Vamos supor que eu prejudiquei alguém. Essa pessoa, diante do eu fiz a ela, revida e também me prejudica. Passamos a alimentar ódio recíproco. Depois de um certo tempo, tomo consciência do meu erro e perdoo a pessoa pelo o que ela me fez.</w:t>
+      </w:r>
+    </w:p>
+    <w:p>
+      <w:pPr>
+        <w:pStyle w:val="Normal"/>
+        <w:jc w:val="both"/>
+        <w:rPr>
+          <w:rFonts w:ascii="Garamond" w:hAnsi="Garamond" w:eastAsia="Times New Roman" w:cs="Times New Roman"/>
+          <w:i w:val="false"/>
+          <w:i w:val="false"/>
+          <w:iCs w:val="false"/>
+          <w:color w:val="000000"/>
+          <w:kern w:val="0"/>
+          <w:sz w:val="36"/>
+          <w:szCs w:val="36"/>
+          <w:shd w:fill="auto" w:val="clear"/>
+          <w:lang w:val="en-US" w:eastAsia="zh-CN" w:bidi="hi-IN"/>
+        </w:rPr>
+      </w:pPr>
+      <w:r>
+        <w:rPr>
+          <w:rFonts w:eastAsia="Times New Roman" w:cs="Times New Roman" w:ascii="Garamond" w:hAnsi="Garamond"/>
+          <w:i w:val="false"/>
+          <w:iCs w:val="false"/>
+          <w:color w:val="000000"/>
+          <w:kern w:val="0"/>
+          <w:sz w:val="36"/>
+          <w:szCs w:val="36"/>
+          <w:shd w:fill="auto" w:val="clear"/>
+          <w:lang w:val="en-US" w:eastAsia="zh-CN" w:bidi="hi-IN"/>
+        </w:rPr>
+      </w:r>
+    </w:p>
+    <w:p>
+      <w:pPr>
+        <w:pStyle w:val="Normal"/>
+        <w:jc w:val="both"/>
+        <w:rPr>
+          <w:rFonts w:ascii="Garamond" w:hAnsi="Garamond" w:eastAsia="Times New Roman" w:cs="Times New Roman"/>
+          <w:i w:val="false"/>
+          <w:i w:val="false"/>
+          <w:iCs w:val="false"/>
+          <w:color w:val="000000"/>
+          <w:kern w:val="0"/>
+          <w:sz w:val="36"/>
+          <w:szCs w:val="36"/>
+          <w:shd w:fill="auto" w:val="clear"/>
+          <w:lang w:val="en-US" w:eastAsia="zh-CN" w:bidi="hi-IN"/>
+        </w:rPr>
+      </w:pPr>
+      <w:r>
+        <w:rPr>
+          <w:rFonts w:eastAsia="Times New Roman" w:cs="Times New Roman" w:ascii="Garamond" w:hAnsi="Garamond"/>
+          <w:i w:val="false"/>
+          <w:iCs w:val="false"/>
+          <w:color w:val="000000"/>
+          <w:kern w:val="0"/>
+          <w:sz w:val="36"/>
+          <w:szCs w:val="36"/>
+          <w:shd w:fill="auto" w:val="clear"/>
+          <w:lang w:val="en-US" w:eastAsia="zh-CN" w:bidi="hi-IN"/>
+        </w:rPr>
+        <w:t>Excelente. Começo a romper os vínculos de ódio do meu lado. Só que eu prejudiquei aquela pessoa. O fato de eu perdoá-la não tira de mim, a responsabilidade de reparar as faltas cometidas contra ela. É algo que terei que fazer no momento oportuno.</w:t>
+      </w:r>
+    </w:p>
+    <w:p>
+      <w:pPr>
+        <w:pStyle w:val="Normal"/>
+        <w:jc w:val="both"/>
+        <w:rPr>
+          <w:rFonts w:ascii="Garamond" w:hAnsi="Garamond" w:eastAsia="Times New Roman" w:cs="Times New Roman"/>
+          <w:i w:val="false"/>
+          <w:i w:val="false"/>
+          <w:iCs w:val="false"/>
+          <w:color w:val="000000"/>
+          <w:kern w:val="0"/>
+          <w:sz w:val="36"/>
+          <w:szCs w:val="36"/>
+          <w:shd w:fill="auto" w:val="clear"/>
+          <w:lang w:val="en-US" w:eastAsia="zh-CN" w:bidi="hi-IN"/>
+        </w:rPr>
+      </w:pPr>
+      <w:r>
+        <w:rPr>
+          <w:rFonts w:eastAsia="Times New Roman" w:cs="Times New Roman" w:ascii="Garamond" w:hAnsi="Garamond"/>
+          <w:i w:val="false"/>
+          <w:iCs w:val="false"/>
+          <w:color w:val="000000"/>
+          <w:kern w:val="0"/>
+          <w:sz w:val="36"/>
+          <w:szCs w:val="36"/>
+          <w:shd w:fill="auto" w:val="clear"/>
+          <w:lang w:val="en-US" w:eastAsia="zh-CN" w:bidi="hi-IN"/>
+        </w:rPr>
+      </w:r>
+    </w:p>
+    <w:p>
+      <w:pPr>
+        <w:pStyle w:val="Normal"/>
+        <w:jc w:val="both"/>
         <w:rPr/>
       </w:pPr>
       <w:r>
+        <w:rPr>
+          <w:rFonts w:eastAsia="Times New Roman" w:cs="Times New Roman" w:ascii="Garamond" w:hAnsi="Garamond"/>
+          <w:i w:val="false"/>
+          <w:iCs w:val="false"/>
+          <w:color w:val="000000"/>
+          <w:kern w:val="0"/>
+          <w:sz w:val="36"/>
+          <w:szCs w:val="36"/>
+          <w:shd w:fill="auto" w:val="clear"/>
+          <w:lang w:val="en-US" w:eastAsia="zh-CN" w:bidi="hi-IN"/>
+        </w:rPr>
+        <w:t>Mas não resta dúvida: o perdão é o primeiro e mais importante passo. Afinal de contas, como vou reconhecer que preciso reparar faltas cometidas contra alguém a quem eu odeio?</w:t>
+      </w:r>
+    </w:p>
+    <w:p>
+      <w:pPr>
+        <w:pStyle w:val="Normal"/>
+        <w:jc w:val="both"/>
+        <w:rPr>
+          <w:rFonts w:ascii="Garamond" w:hAnsi="Garamond" w:eastAsia="Times New Roman" w:cs="Times New Roman"/>
+          <w:i w:val="false"/>
+          <w:i w:val="false"/>
+          <w:iCs w:val="false"/>
+          <w:color w:val="000000"/>
+          <w:kern w:val="0"/>
+          <w:sz w:val="36"/>
+          <w:szCs w:val="36"/>
+          <w:shd w:fill="auto" w:val="clear"/>
+          <w:lang w:val="en-US" w:eastAsia="zh-CN" w:bidi="hi-IN"/>
+        </w:rPr>
+      </w:pPr>
+      <w:r>
+        <w:rPr>
+          <w:rFonts w:eastAsia="Times New Roman" w:cs="Times New Roman" w:ascii="Garamond" w:hAnsi="Garamond"/>
+          <w:i w:val="false"/>
+          <w:iCs w:val="false"/>
+          <w:color w:val="000000"/>
+          <w:kern w:val="0"/>
+          <w:sz w:val="36"/>
+          <w:szCs w:val="36"/>
+          <w:shd w:fill="auto" w:val="clear"/>
+          <w:lang w:val="en-US" w:eastAsia="zh-CN" w:bidi="hi-IN"/>
+        </w:rPr>
+      </w:r>
+    </w:p>
+    <w:p>
+      <w:pPr>
+        <w:pStyle w:val="Normal"/>
+        <w:jc w:val="both"/>
         <w:rPr/>
-      </w:r>
-    </w:p>
-    <w:p>
-      <w:pPr>
-        <w:pStyle w:val="Normal"/>
-        <w:jc w:val="both"/>
-        <w:rPr>
-          <w:sz w:val="36"/>
-          <w:szCs w:val="36"/>
-        </w:rPr>
-      </w:pPr>
-      <w:r>
-        <w:rPr>
-          <w:rFonts w:eastAsia="Times New Roman" w:cs="Times New Roman" w:ascii="Garamond" w:hAnsi="Garamond"/>
-          <w:i w:val="false"/>
-          <w:iCs w:val="false"/>
-          <w:color w:val="000000"/>
-          <w:kern w:val="0"/>
-          <w:sz w:val="36"/>
-          <w:szCs w:val="36"/>
-          <w:shd w:fill="auto" w:val="clear"/>
-          <w:lang w:val="en-US" w:eastAsia="zh-CN" w:bidi="hi-IN"/>
-        </w:rPr>
-        <w:t>Essa é uma questão particularmente importante, considerando que a Terra se encontra em sua fase final de transição para mundo de regeneração. Nos últimos anos, temos sido intensamente alertados sobre a necessidade de empreender esforços para que possamos permanecer na Terra regenerada.</w:t>
-      </w:r>
-    </w:p>
-    <w:p>
-      <w:pPr>
-        <w:pStyle w:val="Normal"/>
-        <w:jc w:val="both"/>
-        <w:rPr>
-          <w:sz w:val="36"/>
-          <w:szCs w:val="36"/>
-        </w:rPr>
-      </w:pPr>
-      <w:r>
+      </w:pPr>
+      <w:r>
+        <w:rPr>
+          <w:rFonts w:eastAsia="Times New Roman" w:cs="Times New Roman" w:ascii="Garamond" w:hAnsi="Garamond"/>
+          <w:i w:val="false"/>
+          <w:iCs w:val="false"/>
+          <w:color w:val="000000"/>
+          <w:kern w:val="0"/>
+          <w:sz w:val="36"/>
+          <w:szCs w:val="36"/>
+          <w:shd w:fill="auto" w:val="clear"/>
+          <w:lang w:val="en-US" w:eastAsia="zh-CN" w:bidi="hi-IN"/>
+        </w:rPr>
+        <w:t xml:space="preserve">Perdão é libertação. Como Kardec nos esclareceu, não quer dizer que, de uma hora para outra, passaremos a nutrir afeto pelos adversários. </w:t>
+      </w:r>
+    </w:p>
+    <w:p>
+      <w:pPr>
+        <w:pStyle w:val="Normal"/>
+        <w:jc w:val="both"/>
+        <w:rPr>
+          <w:rFonts w:ascii="Garamond" w:hAnsi="Garamond" w:eastAsia="Times New Roman" w:cs="Times New Roman"/>
+          <w:i w:val="false"/>
+          <w:i w:val="false"/>
+          <w:iCs w:val="false"/>
+          <w:color w:val="000000"/>
+          <w:kern w:val="0"/>
+          <w:sz w:val="36"/>
+          <w:szCs w:val="36"/>
+          <w:shd w:fill="auto" w:val="clear"/>
+          <w:lang w:val="en-US" w:eastAsia="zh-CN" w:bidi="hi-IN"/>
+        </w:rPr>
+      </w:pPr>
+      <w:r>
+        <w:rPr>
+          <w:rFonts w:eastAsia="Times New Roman" w:cs="Times New Roman" w:ascii="Garamond" w:hAnsi="Garamond"/>
+          <w:i w:val="false"/>
+          <w:iCs w:val="false"/>
+          <w:color w:val="000000"/>
+          <w:kern w:val="0"/>
+          <w:sz w:val="36"/>
+          <w:szCs w:val="36"/>
+          <w:shd w:fill="auto" w:val="clear"/>
+          <w:lang w:val="en-US" w:eastAsia="zh-CN" w:bidi="hi-IN"/>
+        </w:rPr>
+      </w:r>
+    </w:p>
+    <w:p>
+      <w:pPr>
+        <w:pStyle w:val="Normal"/>
+        <w:jc w:val="both"/>
         <w:rPr/>
-      </w:r>
-    </w:p>
-    <w:p>
-      <w:pPr>
-        <w:pStyle w:val="Normal"/>
-        <w:jc w:val="both"/>
-        <w:rPr>
-          <w:sz w:val="36"/>
-          <w:szCs w:val="36"/>
-        </w:rPr>
-      </w:pPr>
-      <w:r>
-        <w:rPr>
-          <w:rFonts w:eastAsia="Times New Roman" w:cs="Times New Roman" w:ascii="Garamond" w:hAnsi="Garamond"/>
-          <w:color w:val="000000"/>
-          <w:kern w:val="0"/>
-          <w:sz w:val="36"/>
-          <w:szCs w:val="36"/>
-          <w:shd w:fill="auto" w:val="clear"/>
-          <w:lang w:val="en-US" w:eastAsia="zh-CN" w:bidi="hi-IN"/>
-        </w:rPr>
-        <w:t>Enquanto alimentarmos ódio, desejo de vingança ou qualquer outro sentimento negativo contra aqueles que nos ofenderam, permaneceremos estacionados em faixas vibratórias inferiores</w:t>
-      </w:r>
-      <w:r>
-        <w:rPr>
-          <w:rFonts w:eastAsia="Times New Roman" w:cs="Times New Roman" w:ascii="Garamond" w:hAnsi="Garamond"/>
-          <w:color w:val="000000"/>
-          <w:kern w:val="0"/>
-          <w:sz w:val="36"/>
-          <w:szCs w:val="36"/>
-          <w:shd w:fill="auto" w:val="clear"/>
-          <w:lang w:val="en-US" w:eastAsia="zh-CN" w:bidi="hi-IN"/>
-        </w:rPr>
-        <w:t>, incompatíveis com um mundo regenerado.</w:t>
-      </w:r>
-    </w:p>
-    <w:p>
-      <w:pPr>
-        <w:pStyle w:val="Normal"/>
-        <w:jc w:val="both"/>
-        <w:rPr>
-          <w:sz w:val="36"/>
-          <w:szCs w:val="36"/>
-        </w:rPr>
-      </w:pPr>
-      <w:r>
-        <w:rPr>
-          <w:sz w:val="36"/>
-          <w:szCs w:val="36"/>
-        </w:rPr>
-      </w:r>
-    </w:p>
-    <w:p>
-      <w:pPr>
-        <w:pStyle w:val="Normal"/>
-        <w:jc w:val="both"/>
-        <w:rPr>
-          <w:sz w:val="36"/>
-          <w:szCs w:val="36"/>
-        </w:rPr>
-      </w:pPr>
-      <w:r>
-        <w:rPr>
-          <w:rFonts w:eastAsia="Times New Roman" w:cs="Times New Roman" w:ascii="Garamond" w:hAnsi="Garamond"/>
-          <w:i w:val="false"/>
-          <w:iCs w:val="false"/>
-          <w:color w:val="000000"/>
-          <w:kern w:val="0"/>
-          <w:sz w:val="36"/>
-          <w:szCs w:val="36"/>
-          <w:shd w:fill="auto" w:val="clear"/>
-          <w:lang w:val="en-US" w:eastAsia="zh-CN" w:bidi="hi-IN"/>
-        </w:rPr>
-        <w:t>A segunda interpretação da prisão mencionada por Jesus refere-se ao nosso estado de consciência. A Doutrina Espírita também nos explica que céu e inferno não são lugares físicos de felicidade ou sofrimento eternos, mas estados da consciência do Espírito, que sofre ou se sente feliz como consequência de suas próprias ações.</w:t>
-      </w:r>
-      <w:r>
-        <w:br w:type="page"/>
-      </w:r>
-    </w:p>
-    <w:p>
-      <w:pPr>
-        <w:pStyle w:val="Normal"/>
-        <w:jc w:val="both"/>
-        <w:rPr>
-          <w:sz w:val="36"/>
-          <w:szCs w:val="36"/>
-        </w:rPr>
-      </w:pPr>
-      <w:r>
-        <w:rPr>
-          <w:rFonts w:eastAsia="Times New Roman" w:cs="Times New Roman" w:ascii="Garamond" w:hAnsi="Garamond"/>
-          <w:i w:val="false"/>
-          <w:iCs w:val="false"/>
-          <w:color w:val="000000"/>
-          <w:kern w:val="0"/>
-          <w:sz w:val="36"/>
-          <w:szCs w:val="36"/>
-          <w:shd w:fill="auto" w:val="clear"/>
-          <w:lang w:val="en-US" w:eastAsia="zh-CN" w:bidi="hi-IN"/>
-        </w:rPr>
-        <w:t>O mesmo acontece com essa prisão da qual Jesus fala. Temos diversos exemplos na literatura espírita de irmãos que permanecem presos ao ódio ou ao desejo de vingança. Eles não conseguem se desvencilhar dessas ideias, permanecendo vinculados a elas durante anos, décadas e, às vezes, séculos.</w:t>
-      </w:r>
-    </w:p>
-    <w:p>
-      <w:pPr>
-        <w:pStyle w:val="Normal"/>
-        <w:jc w:val="both"/>
-        <w:rPr>
-          <w:sz w:val="36"/>
-          <w:szCs w:val="36"/>
-        </w:rPr>
-      </w:pPr>
-      <w:r>
-        <w:rPr/>
-      </w:r>
-    </w:p>
-    <w:p>
-      <w:pPr>
-        <w:pStyle w:val="Normal"/>
-        <w:jc w:val="both"/>
-        <w:rPr>
-          <w:sz w:val="36"/>
-          <w:szCs w:val="36"/>
-        </w:rPr>
-      </w:pPr>
-      <w:r>
-        <w:rPr>
-          <w:rFonts w:eastAsia="Times New Roman" w:cs="Times New Roman" w:ascii="Garamond" w:hAnsi="Garamond"/>
-          <w:i w:val="false"/>
-          <w:iCs w:val="false"/>
-          <w:color w:val="000000"/>
-          <w:kern w:val="0"/>
-          <w:sz w:val="36"/>
-          <w:szCs w:val="36"/>
-          <w:shd w:fill="auto" w:val="clear"/>
-          <w:lang w:val="en-US" w:eastAsia="zh-CN" w:bidi="hi-IN"/>
-        </w:rPr>
-        <w:t xml:space="preserve">Isso pode soar como algo inimaginável, mas não é. Querem um exemplo? Quase todos nós já passamos por alguma ocasião na vida em que somos tomados por uma preocupação incontrolável. </w:t>
-      </w:r>
-    </w:p>
-    <w:p>
-      <w:pPr>
-        <w:pStyle w:val="Normal"/>
-        <w:jc w:val="both"/>
-        <w:rPr>
-          <w:sz w:val="36"/>
-          <w:szCs w:val="36"/>
-        </w:rPr>
-      </w:pPr>
-      <w:r>
-        <w:rPr>
-          <w:sz w:val="36"/>
-          <w:szCs w:val="36"/>
-        </w:rPr>
-      </w:r>
-    </w:p>
-    <w:p>
-      <w:pPr>
-        <w:pStyle w:val="Normal"/>
-        <w:jc w:val="both"/>
-        <w:rPr>
-          <w:sz w:val="36"/>
-          <w:szCs w:val="36"/>
-        </w:rPr>
-      </w:pPr>
-      <w:r>
-        <w:rPr>
-          <w:rFonts w:eastAsia="Times New Roman" w:cs="Times New Roman" w:ascii="Garamond" w:hAnsi="Garamond"/>
-          <w:i w:val="false"/>
-          <w:iCs w:val="false"/>
-          <w:color w:val="000000"/>
-          <w:kern w:val="0"/>
-          <w:sz w:val="36"/>
-          <w:szCs w:val="36"/>
-          <w:shd w:fill="auto" w:val="clear"/>
-          <w:lang w:val="en-US" w:eastAsia="zh-CN" w:bidi="hi-IN"/>
-        </w:rPr>
-        <w:t>As causas são as mais variadas: o diagnóstico de uma doença grave, alguém que amamos passando por grande dificuldade ou até mesmo um problema de ordem financeira.</w:t>
-      </w:r>
-    </w:p>
-    <w:p>
-      <w:pPr>
-        <w:pStyle w:val="Normal"/>
-        <w:jc w:val="both"/>
-        <w:rPr>
-          <w:sz w:val="36"/>
-          <w:szCs w:val="36"/>
-        </w:rPr>
-      </w:pPr>
-      <w:r>
-        <w:rPr>
-          <w:sz w:val="36"/>
-          <w:szCs w:val="36"/>
-        </w:rPr>
-      </w:r>
-    </w:p>
-    <w:p>
-      <w:pPr>
-        <w:pStyle w:val="Normal"/>
-        <w:jc w:val="both"/>
-        <w:rPr>
-          <w:sz w:val="36"/>
-          <w:szCs w:val="36"/>
-        </w:rPr>
-      </w:pPr>
-      <w:r>
-        <w:rPr>
-          <w:rFonts w:eastAsia="Times New Roman" w:cs="Times New Roman" w:ascii="Garamond" w:hAnsi="Garamond"/>
-          <w:i w:val="false"/>
-          <w:iCs w:val="false"/>
-          <w:color w:val="000000"/>
-          <w:kern w:val="0"/>
-          <w:sz w:val="36"/>
-          <w:szCs w:val="36"/>
-          <w:shd w:fill="auto" w:val="clear"/>
-          <w:lang w:val="en-US" w:eastAsia="zh-CN" w:bidi="hi-IN"/>
-        </w:rPr>
-        <w:t>Em momentos assim, aquela preocupação domina nossa mente e nosso coração de tal forma, que somos incapazes de esquecê-la.</w:t>
-      </w:r>
-      <w:r>
-        <w:br w:type="page"/>
-      </w:r>
-    </w:p>
-    <w:p>
-      <w:pPr>
-        <w:pStyle w:val="Normal"/>
-        <w:jc w:val="both"/>
-        <w:rPr>
-          <w:sz w:val="36"/>
-          <w:szCs w:val="36"/>
-        </w:rPr>
-      </w:pPr>
-      <w:r>
-        <w:rPr>
-          <w:rFonts w:eastAsia="Times New Roman" w:cs="Times New Roman" w:ascii="Garamond" w:hAnsi="Garamond"/>
-          <w:i w:val="false"/>
-          <w:iCs w:val="false"/>
-          <w:color w:val="000000"/>
-          <w:kern w:val="0"/>
-          <w:sz w:val="36"/>
-          <w:szCs w:val="36"/>
-          <w:shd w:fill="auto" w:val="clear"/>
-          <w:lang w:val="en-US" w:eastAsia="zh-CN" w:bidi="hi-IN"/>
-        </w:rPr>
-        <w:t>Às vezes não conseguimos nem mesmo orar para pedir ajuda. Começamos nossa oração, a preocupação vem e toma conta de nós. Geralmente precisamos de ajuda externa para sairmos dessa condição.</w:t>
-      </w:r>
-    </w:p>
-    <w:p>
-      <w:pPr>
-        <w:pStyle w:val="Normal"/>
-        <w:jc w:val="both"/>
-        <w:rPr>
-          <w:sz w:val="36"/>
-          <w:szCs w:val="36"/>
-        </w:rPr>
-      </w:pPr>
-      <w:r>
-        <w:rPr>
-          <w:sz w:val="36"/>
-          <w:szCs w:val="36"/>
-        </w:rPr>
-      </w:r>
-    </w:p>
-    <w:p>
-      <w:pPr>
-        <w:pStyle w:val="Normal"/>
-        <w:jc w:val="both"/>
-        <w:rPr>
-          <w:sz w:val="36"/>
-          <w:szCs w:val="36"/>
-        </w:rPr>
-      </w:pPr>
-      <w:r>
-        <w:rPr>
-          <w:rFonts w:eastAsia="Times New Roman" w:cs="Times New Roman" w:ascii="Garamond" w:hAnsi="Garamond"/>
-          <w:i w:val="false"/>
-          <w:iCs w:val="false"/>
-          <w:color w:val="000000"/>
-          <w:kern w:val="0"/>
-          <w:sz w:val="36"/>
-          <w:szCs w:val="36"/>
-          <w:shd w:fill="auto" w:val="clear"/>
-          <w:lang w:val="en-US" w:eastAsia="zh-CN" w:bidi="hi-IN"/>
-        </w:rPr>
-        <w:t>Se somos dominados dessa maneira por uma preocupação legítima, imaginem trazer o coração e a mente transbordando de ódio e desejo de vingança, sobretudo depois de desencarnado.</w:t>
-      </w:r>
-    </w:p>
-    <w:p>
-      <w:pPr>
-        <w:pStyle w:val="Normal"/>
-        <w:jc w:val="both"/>
-        <w:rPr>
-          <w:sz w:val="36"/>
-          <w:szCs w:val="36"/>
-        </w:rPr>
-      </w:pPr>
-      <w:r>
-        <w:rPr/>
-      </w:r>
-    </w:p>
-    <w:p>
-      <w:pPr>
-        <w:pStyle w:val="Normal"/>
-        <w:jc w:val="both"/>
-        <w:rPr>
-          <w:sz w:val="36"/>
-          <w:szCs w:val="36"/>
-        </w:rPr>
-      </w:pPr>
-      <w:r>
-        <w:rPr>
-          <w:rFonts w:eastAsia="Times New Roman" w:cs="Times New Roman" w:ascii="Garamond" w:hAnsi="Garamond"/>
-          <w:i w:val="false"/>
-          <w:iCs w:val="false"/>
-          <w:color w:val="000000"/>
-          <w:kern w:val="0"/>
-          <w:sz w:val="36"/>
-          <w:szCs w:val="36"/>
-          <w:shd w:fill="auto" w:val="clear"/>
-          <w:lang w:val="en-US" w:eastAsia="zh-CN" w:bidi="hi-IN"/>
-        </w:rPr>
-        <w:t xml:space="preserve">O ódio aprisiona </w:t>
-      </w:r>
-      <w:r>
-        <w:rPr>
-          <w:rFonts w:eastAsia="Times New Roman" w:cs="Times New Roman" w:ascii="Garamond" w:hAnsi="Garamond"/>
-          <w:i w:val="false"/>
-          <w:iCs w:val="false"/>
-          <w:color w:val="000000"/>
-          <w:kern w:val="0"/>
-          <w:sz w:val="36"/>
-          <w:szCs w:val="36"/>
-          <w:shd w:fill="auto" w:val="clear"/>
-          <w:lang w:val="en-US" w:eastAsia="zh-CN" w:bidi="hi-IN"/>
-        </w:rPr>
-        <w:t>o Espírito</w:t>
-      </w:r>
-      <w:r>
-        <w:rPr>
-          <w:rFonts w:eastAsia="Times New Roman" w:cs="Times New Roman" w:ascii="Garamond" w:hAnsi="Garamond"/>
-          <w:i w:val="false"/>
-          <w:iCs w:val="false"/>
-          <w:color w:val="000000"/>
-          <w:kern w:val="0"/>
-          <w:sz w:val="36"/>
-          <w:szCs w:val="36"/>
-          <w:shd w:fill="auto" w:val="clear"/>
-          <w:lang w:val="en-US" w:eastAsia="zh-CN" w:bidi="hi-IN"/>
-        </w:rPr>
-        <w:t xml:space="preserve"> que o alimenta contra quem </w:t>
-      </w:r>
-      <w:r>
-        <w:rPr>
-          <w:rFonts w:eastAsia="Times New Roman" w:cs="Times New Roman" w:ascii="Garamond" w:hAnsi="Garamond"/>
-          <w:i w:val="false"/>
-          <w:iCs w:val="false"/>
-          <w:color w:val="000000"/>
-          <w:kern w:val="0"/>
-          <w:sz w:val="36"/>
-          <w:szCs w:val="36"/>
-          <w:shd w:fill="auto" w:val="clear"/>
-          <w:lang w:val="en-US" w:eastAsia="zh-CN" w:bidi="hi-IN"/>
-        </w:rPr>
-        <w:t xml:space="preserve">lhe </w:t>
-      </w:r>
-      <w:r>
-        <w:rPr>
-          <w:rFonts w:eastAsia="Times New Roman" w:cs="Times New Roman" w:ascii="Garamond" w:hAnsi="Garamond"/>
-          <w:i w:val="false"/>
-          <w:iCs w:val="false"/>
-          <w:color w:val="000000"/>
-          <w:kern w:val="0"/>
-          <w:sz w:val="36"/>
-          <w:szCs w:val="36"/>
-          <w:shd w:fill="auto" w:val="clear"/>
-          <w:lang w:val="en-US" w:eastAsia="zh-CN" w:bidi="hi-IN"/>
-        </w:rPr>
-        <w:t>fez mal, e se o sentimento for recíproco, os dois acabam presos na mesma situação, criando uma cadeia de sofrimento que parece não ter fim.</w:t>
+      </w:pPr>
+      <w:r>
+        <w:rPr>
+          <w:rFonts w:eastAsia="Times New Roman" w:cs="Times New Roman" w:ascii="Garamond" w:hAnsi="Garamond"/>
+          <w:i w:val="false"/>
+          <w:iCs w:val="false"/>
+          <w:color w:val="000000"/>
+          <w:kern w:val="0"/>
+          <w:sz w:val="36"/>
+          <w:szCs w:val="36"/>
+          <w:shd w:fill="auto" w:val="clear"/>
+          <w:lang w:val="en-US" w:eastAsia="zh-CN" w:bidi="hi-IN"/>
+        </w:rPr>
+        <w:t>Trata-se de escolhermos não retribuir o mal com o mal, esquecer as ofensas e de procurar, dentro de nossas possibilidades, restabelecer a paz.</w:t>
       </w:r>
     </w:p>
     <w:p>
@@ -5675,601 +5758,6 @@
           <w:shd w:fill="auto" w:val="clear"/>
           <w:lang w:val="en-US" w:eastAsia="zh-CN" w:bidi="hi-IN"/>
         </w:rPr>
-      </w:r>
-    </w:p>
-    <w:p>
-      <w:pPr>
-        <w:pStyle w:val="Normal"/>
-        <w:jc w:val="both"/>
-        <w:rPr>
-          <w:rFonts w:ascii="Garamond" w:hAnsi="Garamond" w:eastAsia="Times New Roman" w:cs="Times New Roman"/>
-          <w:i w:val="false"/>
-          <w:i w:val="false"/>
-          <w:iCs w:val="false"/>
-          <w:color w:val="000000"/>
-          <w:kern w:val="0"/>
-          <w:sz w:val="36"/>
-          <w:szCs w:val="36"/>
-          <w:shd w:fill="auto" w:val="clear"/>
-          <w:lang w:val="en-US" w:eastAsia="zh-CN" w:bidi="hi-IN"/>
-        </w:rPr>
-      </w:pPr>
-      <w:r>
-        <w:rPr>
-          <w:rFonts w:eastAsia="Times New Roman" w:cs="Times New Roman" w:ascii="Garamond" w:hAnsi="Garamond"/>
-          <w:i w:val="false"/>
-          <w:iCs w:val="false"/>
-          <w:color w:val="000000"/>
-          <w:kern w:val="0"/>
-          <w:sz w:val="36"/>
-          <w:szCs w:val="36"/>
-          <w:shd w:fill="auto" w:val="clear"/>
-          <w:lang w:val="en-US" w:eastAsia="zh-CN" w:bidi="hi-IN"/>
-        </w:rPr>
-        <w:t>Esse é o inferno do qual falamos a pouco. Um estado de consciência escravizador. É como se o Espírito estivesse acorrentado àquela ideia. E assim ele vai permanecer até que compreenda o quanto aquilo é prejudicial a ele e aos outros.</w:t>
-      </w:r>
-      <w:r>
-        <w:br w:type="page"/>
-      </w:r>
-    </w:p>
-    <w:p>
-      <w:pPr>
-        <w:pStyle w:val="Normal"/>
-        <w:jc w:val="both"/>
-        <w:rPr>
-          <w:rFonts w:ascii="Garamond" w:hAnsi="Garamond" w:eastAsia="Times New Roman" w:cs="Times New Roman"/>
-          <w:i w:val="false"/>
-          <w:i w:val="false"/>
-          <w:iCs w:val="false"/>
-          <w:color w:val="000000"/>
-          <w:kern w:val="0"/>
-          <w:sz w:val="36"/>
-          <w:szCs w:val="36"/>
-          <w:shd w:fill="auto" w:val="clear"/>
-          <w:lang w:val="en-US" w:eastAsia="zh-CN" w:bidi="hi-IN"/>
-        </w:rPr>
-      </w:pPr>
-      <w:r>
-        <w:rPr>
-          <w:rFonts w:eastAsia="Times New Roman" w:cs="Times New Roman" w:ascii="Garamond" w:hAnsi="Garamond"/>
-          <w:i w:val="false"/>
-          <w:iCs w:val="false"/>
-          <w:color w:val="000000"/>
-          <w:kern w:val="0"/>
-          <w:sz w:val="36"/>
-          <w:szCs w:val="36"/>
-          <w:shd w:fill="auto" w:val="clear"/>
-          <w:lang w:val="en-US" w:eastAsia="zh-CN" w:bidi="hi-IN"/>
-        </w:rPr>
-        <w:t xml:space="preserve">Lembram-se de Nosso Lar? Em que momento Clarêncio conseguiu resgatar André Luiz do Umbral? Apenas quando André, exaurido pela condição em que se encontrava, finalmente eleva um pensamento a Deus e ora. Naquele momento, </w:t>
-      </w:r>
-      <w:r>
-        <w:rPr>
-          <w:rFonts w:eastAsia="Times New Roman" w:cs="Times New Roman" w:ascii="Garamond" w:hAnsi="Garamond"/>
-          <w:i w:val="false"/>
-          <w:iCs w:val="false"/>
-          <w:color w:val="000000"/>
-          <w:kern w:val="0"/>
-          <w:sz w:val="36"/>
-          <w:szCs w:val="36"/>
-          <w:shd w:fill="auto" w:val="clear"/>
-          <w:lang w:val="en-US" w:eastAsia="zh-CN" w:bidi="hi-IN"/>
-        </w:rPr>
-        <w:t>e</w:t>
-      </w:r>
-      <w:r>
-        <w:rPr>
-          <w:rFonts w:eastAsia="Times New Roman" w:cs="Times New Roman" w:ascii="Garamond" w:hAnsi="Garamond"/>
-          <w:i w:val="false"/>
-          <w:iCs w:val="false"/>
-          <w:color w:val="000000"/>
-          <w:kern w:val="0"/>
-          <w:sz w:val="36"/>
-          <w:szCs w:val="36"/>
-          <w:shd w:fill="auto" w:val="clear"/>
-          <w:lang w:val="en-US" w:eastAsia="zh-CN" w:bidi="hi-IN"/>
-        </w:rPr>
-        <w:t>le finalmente se permite ser auxiliado e Clarêncio, que já estava pronto há muito tempo para socorrer André Luiz, consegue resgatá-lo.</w:t>
-      </w:r>
-    </w:p>
-    <w:p>
-      <w:pPr>
-        <w:pStyle w:val="Normal"/>
-        <w:jc w:val="both"/>
-        <w:rPr>
-          <w:rFonts w:ascii="Garamond" w:hAnsi="Garamond" w:eastAsia="Times New Roman" w:cs="Times New Roman"/>
-          <w:i w:val="false"/>
-          <w:i w:val="false"/>
-          <w:iCs w:val="false"/>
-          <w:color w:val="000000"/>
-          <w:kern w:val="0"/>
-          <w:sz w:val="36"/>
-          <w:szCs w:val="36"/>
-          <w:shd w:fill="auto" w:val="clear"/>
-          <w:lang w:val="en-US" w:eastAsia="zh-CN" w:bidi="hi-IN"/>
-        </w:rPr>
-      </w:pPr>
-      <w:r>
-        <w:rPr>
-          <w:rFonts w:eastAsia="Times New Roman" w:cs="Times New Roman" w:ascii="Garamond" w:hAnsi="Garamond"/>
-          <w:i w:val="false"/>
-          <w:iCs w:val="false"/>
-          <w:color w:val="000000"/>
-          <w:kern w:val="0"/>
-          <w:sz w:val="36"/>
-          <w:szCs w:val="36"/>
-          <w:shd w:fill="auto" w:val="clear"/>
-          <w:lang w:val="en-US" w:eastAsia="zh-CN" w:bidi="hi-IN"/>
-        </w:rPr>
-      </w:r>
-    </w:p>
-    <w:p>
-      <w:pPr>
-        <w:pStyle w:val="Normal"/>
-        <w:jc w:val="both"/>
-        <w:rPr>
-          <w:rFonts w:ascii="Garamond" w:hAnsi="Garamond" w:eastAsia="Times New Roman" w:cs="Times New Roman"/>
-          <w:i w:val="false"/>
-          <w:i w:val="false"/>
-          <w:iCs w:val="false"/>
-          <w:color w:val="000000"/>
-          <w:kern w:val="0"/>
-          <w:sz w:val="36"/>
-          <w:szCs w:val="36"/>
-          <w:shd w:fill="auto" w:val="clear"/>
-          <w:lang w:val="en-US" w:eastAsia="zh-CN" w:bidi="hi-IN"/>
-        </w:rPr>
-      </w:pPr>
-      <w:r>
-        <w:rPr>
-          <w:rFonts w:eastAsia="Times New Roman" w:cs="Times New Roman" w:ascii="Garamond" w:hAnsi="Garamond"/>
-          <w:i w:val="false"/>
-          <w:iCs w:val="false"/>
-          <w:color w:val="000000"/>
-          <w:kern w:val="0"/>
-          <w:sz w:val="36"/>
-          <w:szCs w:val="36"/>
-          <w:shd w:fill="auto" w:val="clear"/>
-          <w:lang w:val="en-US" w:eastAsia="zh-CN" w:bidi="hi-IN"/>
-        </w:rPr>
-        <w:t>Deus, Jesus Cristo, nosso anjo de guarda e a Espiritualidade sempre vão respeitar nosso livre arbítrio. Ninguém fará nada por nós enquanto não nos permitirmos ser auxiliados.</w:t>
-      </w:r>
-    </w:p>
-    <w:p>
-      <w:pPr>
-        <w:pStyle w:val="Normal"/>
-        <w:jc w:val="both"/>
-        <w:rPr>
-          <w:rFonts w:ascii="Garamond" w:hAnsi="Garamond" w:eastAsia="Times New Roman" w:cs="Times New Roman"/>
-          <w:i w:val="false"/>
-          <w:i w:val="false"/>
-          <w:iCs w:val="false"/>
-          <w:color w:val="000000"/>
-          <w:kern w:val="0"/>
-          <w:sz w:val="36"/>
-          <w:szCs w:val="36"/>
-          <w:shd w:fill="auto" w:val="clear"/>
-          <w:lang w:val="en-US" w:eastAsia="zh-CN" w:bidi="hi-IN"/>
-        </w:rPr>
-      </w:pPr>
-      <w:r>
-        <w:rPr/>
-      </w:r>
-    </w:p>
-    <w:p>
-      <w:pPr>
-        <w:pStyle w:val="Normal"/>
-        <w:jc w:val="both"/>
-        <w:rPr>
-          <w:rFonts w:ascii="Garamond" w:hAnsi="Garamond" w:eastAsia="Times New Roman" w:cs="Times New Roman"/>
-          <w:i w:val="false"/>
-          <w:i w:val="false"/>
-          <w:iCs w:val="false"/>
-          <w:color w:val="000000"/>
-          <w:kern w:val="0"/>
-          <w:sz w:val="36"/>
-          <w:szCs w:val="36"/>
-          <w:shd w:fill="auto" w:val="clear"/>
-          <w:lang w:val="en-US" w:eastAsia="zh-CN" w:bidi="hi-IN"/>
-        </w:rPr>
-      </w:pPr>
-      <w:r>
-        <w:rPr>
-          <w:rFonts w:eastAsia="Times New Roman" w:cs="Times New Roman" w:ascii="Garamond" w:hAnsi="Garamond"/>
-          <w:i w:val="false"/>
-          <w:iCs w:val="false"/>
-          <w:color w:val="000000"/>
-          <w:kern w:val="0"/>
-          <w:sz w:val="36"/>
-          <w:szCs w:val="36"/>
-          <w:shd w:fill="auto" w:val="clear"/>
-          <w:lang w:val="en-US" w:eastAsia="zh-CN" w:bidi="hi-IN"/>
-        </w:rPr>
-        <w:t>Quando falamos em perdão, sempre surge a seguinte dúvida: o que acontece se eu perdoar a pessoa, mas ela não me perdoar? Bem, se eu consigo superar o ódio, o ressentimento e o desejo de vingança, então eu começo a romper os laços estabelecidos pelo ódio.</w:t>
-      </w:r>
-      <w:r>
-        <w:br w:type="page"/>
-      </w:r>
-    </w:p>
-    <w:p>
-      <w:pPr>
-        <w:pStyle w:val="Normal"/>
-        <w:jc w:val="both"/>
-        <w:rPr>
-          <w:rFonts w:ascii="Garamond" w:hAnsi="Garamond" w:eastAsia="Times New Roman" w:cs="Times New Roman"/>
-          <w:i w:val="false"/>
-          <w:i w:val="false"/>
-          <w:iCs w:val="false"/>
-          <w:color w:val="000000"/>
-          <w:kern w:val="0"/>
-          <w:sz w:val="36"/>
-          <w:szCs w:val="36"/>
-          <w:shd w:fill="auto" w:val="clear"/>
-          <w:lang w:val="en-US" w:eastAsia="zh-CN" w:bidi="hi-IN"/>
-        </w:rPr>
-      </w:pPr>
-      <w:r>
-        <w:rPr>
-          <w:rFonts w:eastAsia="Times New Roman" w:cs="Times New Roman" w:ascii="Garamond" w:hAnsi="Garamond"/>
-          <w:i w:val="false"/>
-          <w:iCs w:val="false"/>
-          <w:color w:val="000000"/>
-          <w:kern w:val="0"/>
-          <w:sz w:val="36"/>
-          <w:szCs w:val="36"/>
-          <w:shd w:fill="auto" w:val="clear"/>
-          <w:lang w:val="en-US" w:eastAsia="zh-CN" w:bidi="hi-IN"/>
-        </w:rPr>
-        <w:t xml:space="preserve">Contudo, há algo que precisa ficar muito claro: o fato de eu perdoar alguém com quem estabeleci vínculos de ódio, não me isenta de responsabilidade de reparar erros que eu </w:t>
-      </w:r>
-      <w:r>
-        <w:rPr>
-          <w:rFonts w:eastAsia="Times New Roman" w:cs="Times New Roman" w:ascii="Garamond" w:hAnsi="Garamond"/>
-          <w:i w:val="false"/>
-          <w:iCs w:val="false"/>
-          <w:color w:val="000000"/>
-          <w:kern w:val="0"/>
-          <w:sz w:val="36"/>
-          <w:szCs w:val="36"/>
-          <w:shd w:fill="auto" w:val="clear"/>
-          <w:lang w:val="en-US" w:eastAsia="zh-CN" w:bidi="hi-IN"/>
-        </w:rPr>
-        <w:t xml:space="preserve">porventura </w:t>
-      </w:r>
-      <w:r>
-        <w:rPr>
-          <w:rFonts w:eastAsia="Times New Roman" w:cs="Times New Roman" w:ascii="Garamond" w:hAnsi="Garamond"/>
-          <w:i w:val="false"/>
-          <w:iCs w:val="false"/>
-          <w:color w:val="000000"/>
-          <w:kern w:val="0"/>
-          <w:sz w:val="36"/>
-          <w:szCs w:val="36"/>
-          <w:shd w:fill="auto" w:val="clear"/>
-          <w:lang w:val="en-US" w:eastAsia="zh-CN" w:bidi="hi-IN"/>
-        </w:rPr>
-        <w:t xml:space="preserve">tenha cometido contra aquela pessoa. </w:t>
-      </w:r>
-    </w:p>
-    <w:p>
-      <w:pPr>
-        <w:pStyle w:val="Normal"/>
-        <w:jc w:val="both"/>
-        <w:rPr>
-          <w:rFonts w:ascii="Garamond" w:hAnsi="Garamond" w:eastAsia="Times New Roman" w:cs="Times New Roman"/>
-          <w:i w:val="false"/>
-          <w:i w:val="false"/>
-          <w:iCs w:val="false"/>
-          <w:color w:val="000000"/>
-          <w:kern w:val="0"/>
-          <w:sz w:val="36"/>
-          <w:szCs w:val="36"/>
-          <w:shd w:fill="auto" w:val="clear"/>
-          <w:lang w:val="en-US" w:eastAsia="zh-CN" w:bidi="hi-IN"/>
-        </w:rPr>
-      </w:pPr>
-      <w:r>
-        <w:rPr>
-          <w:rFonts w:eastAsia="Times New Roman" w:cs="Times New Roman" w:ascii="Garamond" w:hAnsi="Garamond"/>
-          <w:i w:val="false"/>
-          <w:iCs w:val="false"/>
-          <w:color w:val="000000"/>
-          <w:kern w:val="0"/>
-          <w:sz w:val="36"/>
-          <w:szCs w:val="36"/>
-          <w:shd w:fill="auto" w:val="clear"/>
-          <w:lang w:val="en-US" w:eastAsia="zh-CN" w:bidi="hi-IN"/>
-        </w:rPr>
-      </w:r>
-    </w:p>
-    <w:p>
-      <w:pPr>
-        <w:pStyle w:val="Normal"/>
-        <w:jc w:val="both"/>
-        <w:rPr>
-          <w:rFonts w:ascii="Garamond" w:hAnsi="Garamond" w:eastAsia="Times New Roman" w:cs="Times New Roman"/>
-          <w:i w:val="false"/>
-          <w:i w:val="false"/>
-          <w:iCs w:val="false"/>
-          <w:color w:val="000000"/>
-          <w:kern w:val="0"/>
-          <w:sz w:val="36"/>
-          <w:szCs w:val="36"/>
-          <w:shd w:fill="auto" w:val="clear"/>
-          <w:lang w:val="en-US" w:eastAsia="zh-CN" w:bidi="hi-IN"/>
-        </w:rPr>
-      </w:pPr>
-      <w:r>
-        <w:rPr>
-          <w:rFonts w:eastAsia="Times New Roman" w:cs="Times New Roman" w:ascii="Garamond" w:hAnsi="Garamond"/>
-          <w:i w:val="false"/>
-          <w:iCs w:val="false"/>
-          <w:color w:val="000000"/>
-          <w:kern w:val="0"/>
-          <w:sz w:val="36"/>
-          <w:szCs w:val="36"/>
-          <w:shd w:fill="auto" w:val="clear"/>
-          <w:lang w:val="en-US" w:eastAsia="zh-CN" w:bidi="hi-IN"/>
-        </w:rPr>
-        <w:t>Vamos supor que eu prejudiquei alguém. Essa pessoa, diante do eu fiz a ela, revida e também me prejudica. Passamos a alimentar ódio recíproco. Depois de um certo tempo, tomo consciência do meu erro e perdoo a pessoa pelo o que ela me fez.</w:t>
-      </w:r>
-    </w:p>
-    <w:p>
-      <w:pPr>
-        <w:pStyle w:val="Normal"/>
-        <w:jc w:val="both"/>
-        <w:rPr>
-          <w:rFonts w:ascii="Garamond" w:hAnsi="Garamond" w:eastAsia="Times New Roman" w:cs="Times New Roman"/>
-          <w:i w:val="false"/>
-          <w:i w:val="false"/>
-          <w:iCs w:val="false"/>
-          <w:color w:val="000000"/>
-          <w:kern w:val="0"/>
-          <w:sz w:val="36"/>
-          <w:szCs w:val="36"/>
-          <w:shd w:fill="auto" w:val="clear"/>
-          <w:lang w:val="en-US" w:eastAsia="zh-CN" w:bidi="hi-IN"/>
-        </w:rPr>
-      </w:pPr>
-      <w:r>
-        <w:rPr/>
-      </w:r>
-    </w:p>
-    <w:p>
-      <w:pPr>
-        <w:pStyle w:val="Normal"/>
-        <w:jc w:val="both"/>
-        <w:rPr>
-          <w:rFonts w:ascii="Garamond" w:hAnsi="Garamond" w:eastAsia="Times New Roman" w:cs="Times New Roman"/>
-          <w:i w:val="false"/>
-          <w:i w:val="false"/>
-          <w:iCs w:val="false"/>
-          <w:color w:val="000000"/>
-          <w:kern w:val="0"/>
-          <w:sz w:val="36"/>
-          <w:szCs w:val="36"/>
-          <w:shd w:fill="auto" w:val="clear"/>
-          <w:lang w:val="en-US" w:eastAsia="zh-CN" w:bidi="hi-IN"/>
-        </w:rPr>
-      </w:pPr>
-      <w:r>
-        <w:rPr>
-          <w:rFonts w:eastAsia="Times New Roman" w:cs="Times New Roman" w:ascii="Garamond" w:hAnsi="Garamond"/>
-          <w:i w:val="false"/>
-          <w:iCs w:val="false"/>
-          <w:color w:val="000000"/>
-          <w:kern w:val="0"/>
-          <w:sz w:val="36"/>
-          <w:szCs w:val="36"/>
-          <w:shd w:fill="auto" w:val="clear"/>
-          <w:lang w:val="en-US" w:eastAsia="zh-CN" w:bidi="hi-IN"/>
-        </w:rPr>
-        <w:t>Excelente. Começo a romper os vínculos de ódio do meu lado. Só que eu prejudiquei aquela pessoa. O fato de eu perdoá-la não tira de mim, a responsabilidade de reparar as faltas cometidas contra ela. É algo que terei que faze</w:t>
-      </w:r>
-      <w:r>
-        <w:rPr>
-          <w:rFonts w:eastAsia="Times New Roman" w:cs="Times New Roman" w:ascii="Garamond" w:hAnsi="Garamond"/>
-          <w:i w:val="false"/>
-          <w:iCs w:val="false"/>
-          <w:color w:val="000000"/>
-          <w:kern w:val="0"/>
-          <w:sz w:val="36"/>
-          <w:szCs w:val="36"/>
-          <w:shd w:fill="auto" w:val="clear"/>
-          <w:lang w:val="en-US" w:eastAsia="zh-CN" w:bidi="hi-IN"/>
-        </w:rPr>
-        <w:t>r</w:t>
-      </w:r>
-      <w:r>
-        <w:rPr>
-          <w:rFonts w:eastAsia="Times New Roman" w:cs="Times New Roman" w:ascii="Garamond" w:hAnsi="Garamond"/>
-          <w:i w:val="false"/>
-          <w:iCs w:val="false"/>
-          <w:color w:val="000000"/>
-          <w:kern w:val="0"/>
-          <w:sz w:val="36"/>
-          <w:szCs w:val="36"/>
-          <w:shd w:fill="auto" w:val="clear"/>
-          <w:lang w:val="en-US" w:eastAsia="zh-CN" w:bidi="hi-IN"/>
-        </w:rPr>
-        <w:t xml:space="preserve"> no momento oportuno.</w:t>
-      </w:r>
-    </w:p>
-    <w:p>
-      <w:pPr>
-        <w:pStyle w:val="Normal"/>
-        <w:jc w:val="both"/>
-        <w:rPr>
-          <w:rFonts w:ascii="Garamond" w:hAnsi="Garamond" w:eastAsia="Times New Roman" w:cs="Times New Roman"/>
-          <w:i w:val="false"/>
-          <w:i w:val="false"/>
-          <w:iCs w:val="false"/>
-          <w:color w:val="000000"/>
-          <w:kern w:val="0"/>
-          <w:sz w:val="36"/>
-          <w:szCs w:val="36"/>
-          <w:shd w:fill="auto" w:val="clear"/>
-          <w:lang w:val="en-US" w:eastAsia="zh-CN" w:bidi="hi-IN"/>
-        </w:rPr>
-      </w:pPr>
-      <w:r>
-        <w:rPr>
-          <w:rFonts w:eastAsia="Times New Roman" w:cs="Times New Roman" w:ascii="Garamond" w:hAnsi="Garamond"/>
-          <w:i w:val="false"/>
-          <w:iCs w:val="false"/>
-          <w:color w:val="000000"/>
-          <w:kern w:val="0"/>
-          <w:sz w:val="36"/>
-          <w:szCs w:val="36"/>
-          <w:shd w:fill="auto" w:val="clear"/>
-          <w:lang w:val="en-US" w:eastAsia="zh-CN" w:bidi="hi-IN"/>
-        </w:rPr>
-      </w:r>
-    </w:p>
-    <w:p>
-      <w:pPr>
-        <w:pStyle w:val="Normal"/>
-        <w:jc w:val="both"/>
-        <w:rPr/>
-      </w:pPr>
-      <w:r>
-        <w:rPr>
-          <w:rFonts w:eastAsia="Times New Roman" w:cs="Times New Roman" w:ascii="Garamond" w:hAnsi="Garamond"/>
-          <w:i w:val="false"/>
-          <w:iCs w:val="false"/>
-          <w:color w:val="000000"/>
-          <w:kern w:val="0"/>
-          <w:sz w:val="36"/>
-          <w:szCs w:val="36"/>
-          <w:shd w:fill="auto" w:val="clear"/>
-          <w:lang w:val="en-US" w:eastAsia="zh-CN" w:bidi="hi-IN"/>
-        </w:rPr>
-        <w:t>Mas não resta dúvida: o perdão é o primeiro e mais importante passo. Afinal de contas, como vou reconhecer que preciso reparar faltas cometidas contra alguém a quem eu odeio?</w:t>
-      </w:r>
-    </w:p>
-    <w:p>
-      <w:pPr>
-        <w:pStyle w:val="Normal"/>
-        <w:jc w:val="both"/>
-        <w:rPr>
-          <w:rFonts w:ascii="Garamond" w:hAnsi="Garamond" w:eastAsia="Times New Roman" w:cs="Times New Roman"/>
-          <w:i w:val="false"/>
-          <w:i w:val="false"/>
-          <w:iCs w:val="false"/>
-          <w:color w:val="000000"/>
-          <w:kern w:val="0"/>
-          <w:sz w:val="36"/>
-          <w:szCs w:val="36"/>
-          <w:shd w:fill="auto" w:val="clear"/>
-          <w:lang w:val="en-US" w:eastAsia="zh-CN" w:bidi="hi-IN"/>
-        </w:rPr>
-      </w:pPr>
-      <w:r>
-        <w:rPr>
-          <w:rFonts w:eastAsia="Times New Roman" w:cs="Times New Roman" w:ascii="Garamond" w:hAnsi="Garamond"/>
-          <w:i w:val="false"/>
-          <w:iCs w:val="false"/>
-          <w:color w:val="000000"/>
-          <w:kern w:val="0"/>
-          <w:sz w:val="36"/>
-          <w:szCs w:val="36"/>
-          <w:shd w:fill="auto" w:val="clear"/>
-          <w:lang w:val="en-US" w:eastAsia="zh-CN" w:bidi="hi-IN"/>
-        </w:rPr>
-      </w:r>
-    </w:p>
-    <w:p>
-      <w:pPr>
-        <w:pStyle w:val="Normal"/>
-        <w:jc w:val="both"/>
-        <w:rPr/>
-      </w:pPr>
-      <w:r>
-        <w:rPr>
-          <w:rFonts w:eastAsia="Times New Roman" w:cs="Times New Roman" w:ascii="Garamond" w:hAnsi="Garamond"/>
-          <w:i w:val="false"/>
-          <w:iCs w:val="false"/>
-          <w:color w:val="000000"/>
-          <w:kern w:val="0"/>
-          <w:sz w:val="36"/>
-          <w:szCs w:val="36"/>
-          <w:shd w:fill="auto" w:val="clear"/>
-          <w:lang w:val="en-US" w:eastAsia="zh-CN" w:bidi="hi-IN"/>
-        </w:rPr>
-        <w:t xml:space="preserve">Perdão é libertação. Como Kardec nos esclareceu, não quer dizer que, de uma hora para outra, passaremos a nutrir afeto pelos adversários. </w:t>
-      </w:r>
-    </w:p>
-    <w:p>
-      <w:pPr>
-        <w:pStyle w:val="Normal"/>
-        <w:jc w:val="both"/>
-        <w:rPr>
-          <w:rFonts w:ascii="Garamond" w:hAnsi="Garamond" w:eastAsia="Times New Roman" w:cs="Times New Roman"/>
-          <w:i w:val="false"/>
-          <w:i w:val="false"/>
-          <w:iCs w:val="false"/>
-          <w:color w:val="000000"/>
-          <w:kern w:val="0"/>
-          <w:sz w:val="36"/>
-          <w:szCs w:val="36"/>
-          <w:shd w:fill="auto" w:val="clear"/>
-          <w:lang w:val="en-US" w:eastAsia="zh-CN" w:bidi="hi-IN"/>
-        </w:rPr>
-      </w:pPr>
-      <w:r>
-        <w:rPr>
-          <w:rFonts w:eastAsia="Times New Roman" w:cs="Times New Roman" w:ascii="Garamond" w:hAnsi="Garamond"/>
-          <w:i w:val="false"/>
-          <w:iCs w:val="false"/>
-          <w:color w:val="000000"/>
-          <w:kern w:val="0"/>
-          <w:sz w:val="36"/>
-          <w:szCs w:val="36"/>
-          <w:shd w:fill="auto" w:val="clear"/>
-          <w:lang w:val="en-US" w:eastAsia="zh-CN" w:bidi="hi-IN"/>
-        </w:rPr>
-      </w:r>
-    </w:p>
-    <w:p>
-      <w:pPr>
-        <w:pStyle w:val="Normal"/>
-        <w:jc w:val="both"/>
-        <w:rPr/>
-      </w:pPr>
-      <w:r>
-        <w:rPr>
-          <w:rFonts w:eastAsia="Times New Roman" w:cs="Times New Roman" w:ascii="Garamond" w:hAnsi="Garamond"/>
-          <w:i w:val="false"/>
-          <w:iCs w:val="false"/>
-          <w:color w:val="000000"/>
-          <w:kern w:val="0"/>
-          <w:sz w:val="36"/>
-          <w:szCs w:val="36"/>
-          <w:shd w:fill="auto" w:val="clear"/>
-          <w:lang w:val="en-US" w:eastAsia="zh-CN" w:bidi="hi-IN"/>
-        </w:rPr>
-        <w:t>Trata-se de escolhermos não retribuir o mal com o mal, esquecer as ofensas e de procurar, dentro de nossas possibilidades, restabelecer a paz.</w:t>
-      </w:r>
-    </w:p>
-    <w:p>
-      <w:pPr>
-        <w:pStyle w:val="Normal"/>
-        <w:jc w:val="both"/>
-        <w:rPr>
-          <w:rFonts w:ascii="Garamond" w:hAnsi="Garamond" w:eastAsia="Times New Roman" w:cs="Times New Roman"/>
-          <w:i w:val="false"/>
-          <w:i w:val="false"/>
-          <w:iCs w:val="false"/>
-          <w:color w:val="000000"/>
-          <w:kern w:val="0"/>
-          <w:sz w:val="36"/>
-          <w:szCs w:val="36"/>
-          <w:shd w:fill="auto" w:val="clear"/>
-          <w:lang w:val="en-US" w:eastAsia="zh-CN" w:bidi="hi-IN"/>
-        </w:rPr>
-      </w:pPr>
-      <w:r>
-        <w:rPr/>
       </w:r>
     </w:p>
     <w:p>
@@ -6506,7 +5994,17 @@
         </w:rPr>
       </w:pPr>
       <w:r>
-        <w:rPr/>
+        <w:rPr>
+          <w:rFonts w:eastAsia="Times New Roman" w:cs="Times New Roman" w:ascii="Garamond" w:hAnsi="Garamond"/>
+          <w:i w:val="false"/>
+          <w:iCs w:val="false"/>
+          <w:color w:val="000000"/>
+          <w:kern w:val="0"/>
+          <w:sz w:val="36"/>
+          <w:szCs w:val="36"/>
+          <w:shd w:fill="auto" w:val="clear"/>
+          <w:lang w:val="en-US" w:eastAsia="zh-CN" w:bidi="hi-IN"/>
+        </w:rPr>
       </w:r>
     </w:p>
     <w:p>
@@ -6720,7 +6218,17 @@
         </w:rPr>
       </w:pPr>
       <w:r>
-        <w:rPr/>
+        <w:rPr>
+          <w:rFonts w:eastAsia="Times New Roman" w:cs="Times New Roman" w:ascii="Garamond" w:hAnsi="Garamond"/>
+          <w:i w:val="false"/>
+          <w:iCs w:val="false"/>
+          <w:color w:val="000000"/>
+          <w:kern w:val="0"/>
+          <w:sz w:val="36"/>
+          <w:szCs w:val="36"/>
+          <w:shd w:fill="auto" w:val="clear"/>
+          <w:lang w:val="en-US" w:eastAsia="zh-CN" w:bidi="hi-IN"/>
+        </w:rPr>
       </w:r>
     </w:p>
     <w:p>
@@ -7135,35 +6643,7 @@
           <w:shd w:fill="auto" w:val="clear"/>
           <w:lang w:val="en-US" w:eastAsia="zh-CN" w:bidi="hi-IN"/>
         </w:rPr>
-        <w:t xml:space="preserve">Se uma pessoa chegar ao ponto de nos agredir batendo-nos no rosto, e nós mostrarmos a ela a outra face dizendo "Bata também nessa aqui", para o agressor isso vai soar como </w:t>
-      </w:r>
-      <w:r>
-        <w:rPr>
-          <w:rFonts w:eastAsia="Times New Roman" w:cs="Times New Roman" w:ascii="Garamond" w:hAnsi="Garamond"/>
-          <w:i w:val="false"/>
-          <w:iCs w:val="false"/>
-          <w:color w:val="000000"/>
-          <w:kern w:val="0"/>
-          <w:sz w:val="36"/>
-          <w:szCs w:val="36"/>
-          <w:shd w:fill="auto" w:val="clear"/>
-          <w:lang w:val="en-US" w:eastAsia="zh-CN" w:bidi="hi-IN"/>
-        </w:rPr>
-        <w:t>afronta</w:t>
-      </w:r>
-      <w:r>
-        <w:rPr>
-          <w:rFonts w:eastAsia="Times New Roman" w:cs="Times New Roman" w:ascii="Garamond" w:hAnsi="Garamond"/>
-          <w:i w:val="false"/>
-          <w:iCs w:val="false"/>
-          <w:color w:val="000000"/>
-          <w:kern w:val="0"/>
-          <w:sz w:val="36"/>
-          <w:szCs w:val="36"/>
-          <w:shd w:fill="auto" w:val="clear"/>
-          <w:lang w:val="en-US" w:eastAsia="zh-CN" w:bidi="hi-IN"/>
-        </w:rPr>
-        <w:t>, e certamente vai despertar nele uma cólera ainda maior.</w:t>
+        <w:t>Se uma pessoa chegar ao ponto de nos agredir batendo-nos no rosto, e nós mostrarmos a ela a outra face dizendo "Bata também nessa aqui", para o agressor isso vai soar como afronta, e certamente vai despertar nele uma cólera ainda maior.</w:t>
       </w:r>
     </w:p>
     <w:p>
@@ -7455,7 +6935,69 @@
         </w:rPr>
       </w:pPr>
       <w:r>
+        <w:rPr>
+          <w:rFonts w:eastAsia="Times New Roman" w:cs="Times New Roman" w:ascii="Garamond" w:hAnsi="Garamond"/>
+          <w:i w:val="false"/>
+          <w:iCs w:val="false"/>
+          <w:color w:val="000000"/>
+          <w:kern w:val="0"/>
+          <w:sz w:val="36"/>
+          <w:szCs w:val="36"/>
+          <w:shd w:fill="auto" w:val="clear"/>
+          <w:lang w:val="en-US" w:eastAsia="zh-CN" w:bidi="hi-IN"/>
+        </w:rPr>
+      </w:r>
+    </w:p>
+    <w:p>
+      <w:pPr>
+        <w:pStyle w:val="Normal"/>
+        <w:jc w:val="both"/>
         <w:rPr/>
+      </w:pPr>
+      <w:r>
+        <w:rPr>
+          <w:rFonts w:eastAsia="Times New Roman" w:cs="Times New Roman" w:ascii="Garamond" w:hAnsi="Garamond"/>
+          <w:i w:val="false"/>
+          <w:iCs w:val="false"/>
+          <w:color w:val="000000"/>
+          <w:kern w:val="0"/>
+          <w:sz w:val="36"/>
+          <w:szCs w:val="36"/>
+          <w:shd w:fill="auto" w:val="clear"/>
+          <w:lang w:val="en-US" w:eastAsia="zh-CN" w:bidi="hi-IN"/>
+        </w:rPr>
+        <w:t>E vamos responder para nós mesmos: saímos realmente bem dessa discussão? Quando ela terminou, nossa sensação era de paz, de tranquilidade, de leveza e serenidade? Tenho certeza que a resposta é não.</w:t>
+      </w:r>
+    </w:p>
+    <w:p>
+      <w:pPr>
+        <w:pStyle w:val="Normal"/>
+        <w:jc w:val="both"/>
+        <w:rPr>
+          <w:rFonts w:ascii="Garamond" w:hAnsi="Garamond" w:eastAsia="Times New Roman" w:cs="Times New Roman"/>
+          <w:i w:val="false"/>
+          <w:i w:val="false"/>
+          <w:iCs w:val="false"/>
+          <w:color w:val="000000"/>
+          <w:kern w:val="0"/>
+          <w:sz w:val="36"/>
+          <w:szCs w:val="36"/>
+          <w:shd w:fill="auto" w:val="clear"/>
+          <w:lang w:val="en-US" w:eastAsia="zh-CN" w:bidi="hi-IN"/>
+        </w:rPr>
+      </w:pPr>
+      <w:r>
+        <w:rPr>
+          <w:rFonts w:eastAsia="Times New Roman" w:cs="Times New Roman" w:ascii="Garamond" w:hAnsi="Garamond"/>
+          <w:i w:val="false"/>
+          <w:iCs w:val="false"/>
+          <w:color w:val="000000"/>
+          <w:kern w:val="0"/>
+          <w:sz w:val="36"/>
+          <w:szCs w:val="36"/>
+          <w:shd w:fill="auto" w:val="clear"/>
+          <w:lang w:val="en-US" w:eastAsia="zh-CN" w:bidi="hi-IN"/>
+        </w:rPr>
       </w:r>
     </w:p>
     <w:p>
@@ -7476,7 +7018,31 @@
           <w:shd w:fill="auto" w:val="clear"/>
           <w:lang w:val="en-US" w:eastAsia="zh-CN" w:bidi="hi-IN"/>
         </w:rPr>
-        <w:t>E vamos responder para nós mesmos: saímos realmente bem dessa discussão? Quando ela terminou, nossa sensação era de paz, de tranquilidade, de leveza e serenidade? Tenho certeza que a resposta é não.</w:t>
+        <w:t>Por mais que tenhamos pensado "Joguei na cara dele ou dela tudo o que queria, não levei desaforo para casa", a verdade é que essa postura não nos trouxe paz interior, e é bastante provável que algum tempo depois tenhamos sentido remorso e arrependimento pelo nosso comportamento.</w:t>
+      </w:r>
+      <w:r>
+        <w:br w:type="page"/>
+      </w:r>
+    </w:p>
+    <w:p>
+      <w:pPr>
+        <w:pStyle w:val="Normal"/>
+        <w:jc w:val="both"/>
+        <w:rPr/>
+      </w:pPr>
+      <w:r>
+        <w:rPr>
+          <w:rFonts w:eastAsia="Times New Roman" w:cs="Times New Roman" w:ascii="Garamond" w:hAnsi="Garamond"/>
+          <w:i w:val="false"/>
+          <w:iCs w:val="false"/>
+          <w:color w:val="000000"/>
+          <w:kern w:val="0"/>
+          <w:sz w:val="36"/>
+          <w:szCs w:val="36"/>
+          <w:shd w:fill="auto" w:val="clear"/>
+          <w:lang w:val="en-US" w:eastAsia="zh-CN" w:bidi="hi-IN"/>
+        </w:rPr>
+        <w:t>Por outro lado, quando oferecemos a outra face as coisas são bem diferentes. Podemos até sair dos conflitos tristes e magoados, mas pouco tempo depois olhamos para dentro de nós e nos sentimos felizes por termos mantido a serenidade sem revidar as ofensas.</w:t>
       </w:r>
     </w:p>
     <w:p>
@@ -7528,10 +7094,38 @@
           <w:shd w:fill="auto" w:val="clear"/>
           <w:lang w:val="en-US" w:eastAsia="zh-CN" w:bidi="hi-IN"/>
         </w:rPr>
-        <w:t>Por mais que tenhamos pensado "Joguei na cara dele ou dela tudo o que queria, não levei desaforo para casa", a verdade é que essa postura não nos trouxe paz interior, e é bastante provável que algum tempo depois tenhamos sentido remorso e arrependimento pelo nosso comportamento.</w:t>
-      </w:r>
-      <w:r>
-        <w:br w:type="page"/>
+        <w:t>E tem mais: quando agimos assim, as chances de fazer com que nosso agressor reflita sobre a atitude dele são muito maiores. Como dissemos anteriormente, a consciência da pessoa pesa e ela pensa: "Poxa vida. Eu discuti com fulano, falei um monte de coisas ruins e desagradáveis e ele não revidou. Sinto-me mal por isso".</w:t>
+      </w:r>
+    </w:p>
+    <w:p>
+      <w:pPr>
+        <w:pStyle w:val="Normal"/>
+        <w:jc w:val="both"/>
+        <w:rPr>
+          <w:rFonts w:ascii="Garamond" w:hAnsi="Garamond" w:eastAsia="Times New Roman" w:cs="Times New Roman"/>
+          <w:i w:val="false"/>
+          <w:i w:val="false"/>
+          <w:iCs w:val="false"/>
+          <w:color w:val="000000"/>
+          <w:kern w:val="0"/>
+          <w:sz w:val="36"/>
+          <w:szCs w:val="36"/>
+          <w:shd w:fill="auto" w:val="clear"/>
+          <w:lang w:val="en-US" w:eastAsia="zh-CN" w:bidi="hi-IN"/>
+        </w:rPr>
+      </w:pPr>
+      <w:r>
+        <w:rPr>
+          <w:rFonts w:eastAsia="Times New Roman" w:cs="Times New Roman" w:ascii="Garamond" w:hAnsi="Garamond"/>
+          <w:i w:val="false"/>
+          <w:iCs w:val="false"/>
+          <w:color w:val="000000"/>
+          <w:kern w:val="0"/>
+          <w:sz w:val="36"/>
+          <w:szCs w:val="36"/>
+          <w:shd w:fill="auto" w:val="clear"/>
+          <w:lang w:val="en-US" w:eastAsia="zh-CN" w:bidi="hi-IN"/>
+        </w:rPr>
       </w:r>
     </w:p>
     <w:p>
@@ -7552,7 +7146,7 @@
           <w:shd w:fill="auto" w:val="clear"/>
           <w:lang w:val="en-US" w:eastAsia="zh-CN" w:bidi="hi-IN"/>
         </w:rPr>
-        <w:t>Por outro lado, quando oferecemos a outra face as coisas são bem diferentes. Podemos até sair dos conflitos tristes e magoados, mas pouco tempo depois olhamos para dentro de nós e nos sentimos felizes por termos mantido a serenidade sem revidar as ofensas.</w:t>
+        <w:t>Não é que queiramos que a pessoa se sinta mal. Muito pelo contrário: pode nascer daí uma mudança de comportamento por parte dela, impulsionada pela nossa postura.</w:t>
       </w:r>
     </w:p>
     <w:p>
@@ -7604,144 +7198,834 @@
           <w:shd w:fill="auto" w:val="clear"/>
           <w:lang w:val="en-US" w:eastAsia="zh-CN" w:bidi="hi-IN"/>
         </w:rPr>
-        <w:t>E tem mais: quando agimos assim, as chances de fazer com que nosso agressor reflita sobre a atitude dele são muito maiores. Como dissemos anteriormente, a consciência da pessoa pesa e ela pensa: "Poxa vida. Eu discuti com fulano, falei um monte de coisas ruins e desagradáveis e ele não revidou. Sinto-me mal por isso".</w:t>
-      </w:r>
-    </w:p>
-    <w:p>
-      <w:pPr>
-        <w:pStyle w:val="Normal"/>
-        <w:jc w:val="both"/>
-        <w:rPr>
-          <w:rFonts w:ascii="Garamond" w:hAnsi="Garamond" w:eastAsia="Times New Roman" w:cs="Times New Roman"/>
-          <w:i w:val="false"/>
-          <w:i w:val="false"/>
-          <w:iCs w:val="false"/>
-          <w:color w:val="000000"/>
-          <w:kern w:val="0"/>
-          <w:sz w:val="36"/>
-          <w:szCs w:val="36"/>
-          <w:shd w:fill="auto" w:val="clear"/>
-          <w:lang w:val="en-US" w:eastAsia="zh-CN" w:bidi="hi-IN"/>
-        </w:rPr>
-      </w:pPr>
-      <w:r>
-        <w:rPr>
-          <w:rFonts w:eastAsia="Times New Roman" w:cs="Times New Roman" w:ascii="Garamond" w:hAnsi="Garamond"/>
-          <w:i w:val="false"/>
-          <w:iCs w:val="false"/>
-          <w:color w:val="000000"/>
-          <w:kern w:val="0"/>
-          <w:sz w:val="36"/>
-          <w:szCs w:val="36"/>
-          <w:shd w:fill="auto" w:val="clear"/>
-          <w:lang w:val="en-US" w:eastAsia="zh-CN" w:bidi="hi-IN"/>
-        </w:rPr>
-      </w:r>
-    </w:p>
-    <w:p>
-      <w:pPr>
-        <w:pStyle w:val="Normal"/>
-        <w:jc w:val="both"/>
+        <w:t xml:space="preserve">Portanto, é muito melhor que sejamos ofendidos do que ofensores. </w:t>
+      </w:r>
+    </w:p>
+    <w:p>
+      <w:pPr>
+        <w:pStyle w:val="Normal"/>
+        <w:jc w:val="both"/>
+        <w:rPr>
+          <w:rFonts w:ascii="Garamond" w:hAnsi="Garamond"/>
+        </w:rPr>
+      </w:pPr>
+      <w:r>
+        <w:rPr>
+          <w:rFonts w:ascii="Garamond" w:hAnsi="Garamond"/>
+        </w:rPr>
+      </w:r>
+    </w:p>
+    <w:p>
+      <w:pPr>
+        <w:pStyle w:val="Normal"/>
+        <w:jc w:val="both"/>
+        <w:rPr>
+          <w:rFonts w:ascii="Garamond" w:hAnsi="Garamond"/>
+          <w:sz w:val="36"/>
+          <w:szCs w:val="36"/>
+        </w:rPr>
+      </w:pPr>
+      <w:r>
+        <w:rPr>
+          <w:rFonts w:ascii="Garamond" w:hAnsi="Garamond"/>
+          <w:sz w:val="36"/>
+          <w:szCs w:val="36"/>
+        </w:rPr>
+        <w:t>[ Prosseguir desse ponto ]</w:t>
+      </w:r>
+    </w:p>
+    <w:p>
+      <w:pPr>
+        <w:pStyle w:val="Normal"/>
+        <w:jc w:val="both"/>
+        <w:rPr>
+          <w:rFonts w:ascii="Garamond" w:hAnsi="Garamond"/>
+          <w:sz w:val="36"/>
+          <w:szCs w:val="36"/>
+        </w:rPr>
+      </w:pPr>
+      <w:r>
         <w:rPr/>
-      </w:pPr>
-      <w:r>
-        <w:rPr>
-          <w:rFonts w:eastAsia="Times New Roman" w:cs="Times New Roman" w:ascii="Garamond" w:hAnsi="Garamond"/>
-          <w:i w:val="false"/>
-          <w:iCs w:val="false"/>
-          <w:color w:val="000000"/>
-          <w:kern w:val="0"/>
-          <w:sz w:val="36"/>
-          <w:szCs w:val="36"/>
-          <w:shd w:fill="auto" w:val="clear"/>
-          <w:lang w:val="en-US" w:eastAsia="zh-CN" w:bidi="hi-IN"/>
-        </w:rPr>
-        <w:t>Não é que queiramos que a pessoa se sinta mal. Muito pelo contrário: pode nascer daí uma mudança de comportamento por parte dela, impulsionada pela nossa postura.</w:t>
-      </w:r>
-    </w:p>
-    <w:p>
-      <w:pPr>
-        <w:pStyle w:val="Normal"/>
-        <w:jc w:val="both"/>
-        <w:rPr>
-          <w:rFonts w:ascii="Garamond" w:hAnsi="Garamond" w:eastAsia="Times New Roman" w:cs="Times New Roman"/>
-          <w:i w:val="false"/>
-          <w:i w:val="false"/>
-          <w:iCs w:val="false"/>
-          <w:color w:val="000000"/>
-          <w:kern w:val="0"/>
-          <w:sz w:val="36"/>
-          <w:szCs w:val="36"/>
-          <w:shd w:fill="auto" w:val="clear"/>
-          <w:lang w:val="en-US" w:eastAsia="zh-CN" w:bidi="hi-IN"/>
-        </w:rPr>
-      </w:pPr>
-      <w:r>
-        <w:rPr>
-          <w:rFonts w:eastAsia="Times New Roman" w:cs="Times New Roman" w:ascii="Garamond" w:hAnsi="Garamond"/>
-          <w:i w:val="false"/>
-          <w:iCs w:val="false"/>
-          <w:color w:val="000000"/>
-          <w:kern w:val="0"/>
-          <w:sz w:val="36"/>
-          <w:szCs w:val="36"/>
-          <w:shd w:fill="auto" w:val="clear"/>
-          <w:lang w:val="en-US" w:eastAsia="zh-CN" w:bidi="hi-IN"/>
-        </w:rPr>
-      </w:r>
-    </w:p>
-    <w:p>
-      <w:pPr>
-        <w:pStyle w:val="Normal"/>
-        <w:jc w:val="both"/>
+      </w:r>
+    </w:p>
+    <w:p>
+      <w:pPr>
+        <w:pStyle w:val="Normal"/>
+        <w:jc w:val="both"/>
+        <w:rPr>
+          <w:rFonts w:ascii="Garamond" w:hAnsi="Garamond"/>
+          <w:sz w:val="36"/>
+          <w:szCs w:val="36"/>
+        </w:rPr>
+      </w:pPr>
+      <w:r>
+        <w:rPr>
+          <w:rFonts w:ascii="Garamond" w:hAnsi="Garamond"/>
+          <w:sz w:val="36"/>
+          <w:szCs w:val="36"/>
+        </w:rPr>
+        <w:t>### Os inimigos internos - Início</w:t>
+      </w:r>
+    </w:p>
+    <w:p>
+      <w:pPr>
+        <w:pStyle w:val="Normal"/>
+        <w:jc w:val="both"/>
+        <w:rPr>
+          <w:rFonts w:ascii="Garamond" w:hAnsi="Garamond"/>
+          <w:sz w:val="36"/>
+          <w:szCs w:val="36"/>
+        </w:rPr>
+      </w:pPr>
+      <w:r>
         <w:rPr/>
-      </w:pPr>
-      <w:r>
-        <w:rPr>
-          <w:rFonts w:eastAsia="Times New Roman" w:cs="Times New Roman" w:ascii="Garamond" w:hAnsi="Garamond"/>
-          <w:i w:val="false"/>
-          <w:iCs w:val="false"/>
-          <w:color w:val="000000"/>
-          <w:kern w:val="0"/>
-          <w:sz w:val="36"/>
-          <w:szCs w:val="36"/>
-          <w:shd w:fill="auto" w:val="clear"/>
-          <w:lang w:val="en-US" w:eastAsia="zh-CN" w:bidi="hi-IN"/>
-        </w:rPr>
-        <w:t xml:space="preserve">Portanto, é muito melhor que sejamos ofendidos do que ofensores. </w:t>
-      </w:r>
-    </w:p>
-    <w:p>
-      <w:pPr>
-        <w:pStyle w:val="Normal"/>
-        <w:jc w:val="both"/>
-        <w:rPr>
-          <w:rFonts w:ascii="Garamond" w:hAnsi="Garamond"/>
-        </w:rPr>
-      </w:pPr>
-      <w:r>
-        <w:rPr>
-          <w:rFonts w:ascii="Garamond" w:hAnsi="Garamond"/>
-        </w:rPr>
-      </w:r>
-    </w:p>
-    <w:p>
-      <w:pPr>
-        <w:pStyle w:val="Normal"/>
-        <w:jc w:val="both"/>
-        <w:rPr>
-          <w:rFonts w:ascii="Garamond" w:hAnsi="Garamond"/>
-          <w:sz w:val="36"/>
-          <w:szCs w:val="36"/>
-        </w:rPr>
-      </w:pPr>
-      <w:r>
-        <w:rPr>
-          <w:rFonts w:ascii="Garamond" w:hAnsi="Garamond"/>
-          <w:sz w:val="36"/>
-          <w:szCs w:val="36"/>
-        </w:rPr>
-        <w:t>[ Prosseguir desse ponto ]</w:t>
+      </w:r>
+    </w:p>
+    <w:p>
+      <w:pPr>
+        <w:pStyle w:val="Normal"/>
+        <w:jc w:val="both"/>
+        <w:rPr>
+          <w:rFonts w:ascii="Garamond" w:hAnsi="Garamond"/>
+          <w:sz w:val="36"/>
+          <w:szCs w:val="36"/>
+        </w:rPr>
+      </w:pPr>
+      <w:r>
+        <w:rPr>
+          <w:rFonts w:eastAsia="Arial" w:cs="Arial" w:ascii="Garamond" w:hAnsi="Garamond"/>
+          <w:color w:val="auto"/>
+          <w:kern w:val="0"/>
+          <w:sz w:val="36"/>
+          <w:szCs w:val="36"/>
+          <w:lang w:val="en-US" w:eastAsia="zh-CN" w:bidi="hi-IN"/>
+        </w:rPr>
+        <w:t>A</w:t>
+      </w:r>
+      <w:r>
+        <w:rPr>
+          <w:rFonts w:ascii="Garamond" w:hAnsi="Garamond"/>
+          <w:sz w:val="36"/>
+          <w:szCs w:val="36"/>
+        </w:rPr>
+        <w:t xml:space="preserve">té aqui temos </w:t>
+      </w:r>
+      <w:r>
+        <w:rPr>
+          <w:rFonts w:eastAsia="Arial" w:cs="Arial" w:ascii="Garamond" w:hAnsi="Garamond"/>
+          <w:color w:val="auto"/>
+          <w:kern w:val="0"/>
+          <w:sz w:val="36"/>
+          <w:szCs w:val="36"/>
+          <w:lang w:val="en-US" w:eastAsia="zh-CN" w:bidi="hi-IN"/>
+        </w:rPr>
+        <w:t>falado</w:t>
+      </w:r>
+      <w:r>
+        <w:rPr>
+          <w:rFonts w:ascii="Garamond" w:hAnsi="Garamond"/>
+          <w:sz w:val="36"/>
+          <w:szCs w:val="36"/>
+        </w:rPr>
+        <w:t xml:space="preserve"> de inimigos como sendo pessoas ou Espíritos que caminham conosco. Entretanto, precisamos considerá-los sob um outro ponto de vista: </w:t>
+      </w:r>
+      <w:r>
+        <w:rPr>
+          <w:rFonts w:eastAsia="Arial" w:cs="Arial" w:ascii="Garamond" w:hAnsi="Garamond"/>
+          <w:color w:val="auto"/>
+          <w:kern w:val="0"/>
+          <w:sz w:val="36"/>
+          <w:szCs w:val="36"/>
+          <w:lang w:val="en-US" w:eastAsia="zh-CN" w:bidi="hi-IN"/>
+        </w:rPr>
+        <w:t>os inimigos</w:t>
+      </w:r>
+      <w:r>
+        <w:rPr>
+          <w:rFonts w:ascii="Garamond" w:hAnsi="Garamond"/>
+          <w:sz w:val="36"/>
+          <w:szCs w:val="36"/>
+        </w:rPr>
+        <w:t xml:space="preserve"> que carregamos dentro de nós.</w:t>
+      </w:r>
+    </w:p>
+    <w:p>
+      <w:pPr>
+        <w:pStyle w:val="Normal"/>
+        <w:jc w:val="both"/>
+        <w:rPr>
+          <w:rFonts w:ascii="Garamond" w:hAnsi="Garamond"/>
+          <w:sz w:val="36"/>
+          <w:szCs w:val="36"/>
+        </w:rPr>
+      </w:pPr>
+      <w:r>
+        <w:rPr/>
+      </w:r>
+    </w:p>
+    <w:p>
+      <w:pPr>
+        <w:pStyle w:val="Normal"/>
+        <w:jc w:val="both"/>
+        <w:rPr>
+          <w:rFonts w:ascii="Garamond" w:hAnsi="Garamond"/>
+          <w:sz w:val="36"/>
+          <w:szCs w:val="36"/>
+        </w:rPr>
+      </w:pPr>
+      <w:r>
+        <w:rPr>
+          <w:rFonts w:ascii="Garamond" w:hAnsi="Garamond"/>
+          <w:sz w:val="36"/>
+          <w:szCs w:val="36"/>
+        </w:rPr>
+        <w:t xml:space="preserve">No ESE, capítulo XXVIII - </w:t>
+      </w:r>
+      <w:r>
+        <w:rPr>
+          <w:rFonts w:ascii="Garamond" w:hAnsi="Garamond"/>
+          <w:i/>
+          <w:iCs/>
+          <w:sz w:val="36"/>
+          <w:szCs w:val="36"/>
+        </w:rPr>
+        <w:t>Coletânea de preces espíritas</w:t>
+      </w:r>
+      <w:r>
+        <w:rPr>
+          <w:rFonts w:ascii="Garamond" w:hAnsi="Garamond"/>
+          <w:sz w:val="36"/>
+          <w:szCs w:val="36"/>
+        </w:rPr>
+        <w:t xml:space="preserve">, lá na prece para </w:t>
+      </w:r>
+      <w:r>
+        <w:rPr>
+          <w:rFonts w:ascii="Garamond" w:hAnsi="Garamond"/>
+          <w:i/>
+          <w:iCs/>
+          <w:sz w:val="36"/>
+          <w:szCs w:val="36"/>
+        </w:rPr>
+        <w:t>Pedir a corrigenda de um defeito</w:t>
+      </w:r>
+      <w:r>
+        <w:rPr>
+          <w:rFonts w:ascii="Garamond" w:hAnsi="Garamond"/>
+          <w:sz w:val="36"/>
+          <w:szCs w:val="36"/>
+        </w:rPr>
+        <w:t xml:space="preserve"> Kardec </w:t>
+      </w:r>
+      <w:r>
+        <w:rPr>
+          <w:rFonts w:eastAsia="Arial" w:cs="Arial" w:ascii="Garamond" w:hAnsi="Garamond"/>
+          <w:color w:val="auto"/>
+          <w:kern w:val="0"/>
+          <w:sz w:val="36"/>
+          <w:szCs w:val="36"/>
+          <w:lang w:val="en-US" w:eastAsia="zh-CN" w:bidi="hi-IN"/>
+        </w:rPr>
+        <w:t>escreveu</w:t>
+      </w:r>
+      <w:r>
+        <w:rPr>
+          <w:rFonts w:ascii="Garamond" w:hAnsi="Garamond"/>
+          <w:sz w:val="36"/>
+          <w:szCs w:val="36"/>
+        </w:rPr>
+        <w:t>:</w:t>
+      </w:r>
+    </w:p>
+    <w:p>
+      <w:pPr>
+        <w:pStyle w:val="Normal"/>
+        <w:jc w:val="both"/>
+        <w:rPr>
+          <w:rFonts w:ascii="Garamond" w:hAnsi="Garamond"/>
+          <w:sz w:val="36"/>
+          <w:szCs w:val="36"/>
+        </w:rPr>
+      </w:pPr>
+      <w:r>
+        <w:rPr/>
+      </w:r>
+    </w:p>
+    <w:p>
+      <w:pPr>
+        <w:pStyle w:val="Normal"/>
+        <w:ind w:left="720" w:hanging="0"/>
+        <w:jc w:val="both"/>
+        <w:rPr>
+          <w:rFonts w:ascii="Garamond" w:hAnsi="Garamond"/>
+          <w:sz w:val="36"/>
+          <w:szCs w:val="36"/>
+        </w:rPr>
+      </w:pPr>
+      <w:r>
+        <w:rPr>
+          <w:rFonts w:ascii="Garamond" w:hAnsi="Garamond"/>
+          <w:i/>
+          <w:iCs/>
+          <w:sz w:val="36"/>
+          <w:szCs w:val="36"/>
+        </w:rPr>
+        <w:t>Os defeitos são barreiras que nos separam de Deus e cada um que eu suprima será um passo dado na senda do progresso que dele me há de aproximar.</w:t>
+      </w:r>
+      <w:r>
+        <w:rPr>
+          <w:rFonts w:ascii="Garamond" w:hAnsi="Garamond"/>
+          <w:sz w:val="36"/>
+          <w:szCs w:val="36"/>
+        </w:rPr>
+        <w:t xml:space="preserve"> </w:t>
+      </w:r>
+    </w:p>
+    <w:p>
+      <w:pPr>
+        <w:pStyle w:val="Normal"/>
+        <w:jc w:val="both"/>
+        <w:rPr>
+          <w:rFonts w:ascii="Garamond" w:hAnsi="Garamond"/>
+          <w:sz w:val="36"/>
+          <w:szCs w:val="36"/>
+        </w:rPr>
+      </w:pPr>
+      <w:r>
+        <w:rPr/>
+      </w:r>
+    </w:p>
+    <w:p>
+      <w:pPr>
+        <w:pStyle w:val="Normal"/>
+        <w:jc w:val="both"/>
+        <w:rPr>
+          <w:rFonts w:ascii="Garamond" w:hAnsi="Garamond" w:eastAsia="Arial" w:cs="Arial"/>
+          <w:color w:val="auto"/>
+          <w:kern w:val="0"/>
+          <w:sz w:val="36"/>
+          <w:szCs w:val="36"/>
+          <w:lang w:val="en-US" w:eastAsia="zh-CN" w:bidi="hi-IN"/>
+        </w:rPr>
+      </w:pPr>
+      <w:r>
+        <w:rPr>
+          <w:rFonts w:eastAsia="Arial" w:cs="Arial" w:ascii="Garamond" w:hAnsi="Garamond"/>
+          <w:color w:val="auto"/>
+          <w:kern w:val="0"/>
+          <w:sz w:val="36"/>
+          <w:szCs w:val="36"/>
+          <w:lang w:val="en-US" w:eastAsia="zh-CN" w:bidi="hi-IN"/>
+        </w:rPr>
+        <w:t>Orgulho, egoísmo, inveja, vaidade, impaciência, entre outros, são obstáculos que  trabalham contra o nosso progresso moral e contra nossa felicidade. Portanto, são também nossos inimigos.</w:t>
+      </w:r>
+    </w:p>
+    <w:p>
+      <w:pPr>
+        <w:pStyle w:val="Normal"/>
+        <w:jc w:val="both"/>
+        <w:rPr>
+          <w:rFonts w:ascii="Garamond" w:hAnsi="Garamond" w:eastAsia="Arial" w:cs="Arial"/>
+          <w:color w:val="auto"/>
+          <w:kern w:val="0"/>
+          <w:sz w:val="36"/>
+          <w:szCs w:val="36"/>
+          <w:lang w:val="en-US" w:eastAsia="zh-CN" w:bidi="hi-IN"/>
+        </w:rPr>
+      </w:pPr>
+      <w:r>
+        <w:rPr>
+          <w:rFonts w:eastAsia="Arial" w:cs="Arial" w:ascii="Garamond" w:hAnsi="Garamond"/>
+          <w:color w:val="auto"/>
+          <w:kern w:val="0"/>
+          <w:sz w:val="36"/>
+          <w:szCs w:val="36"/>
+          <w:lang w:val="en-US" w:eastAsia="zh-CN" w:bidi="hi-IN"/>
+        </w:rPr>
+      </w:r>
+    </w:p>
+    <w:p>
+      <w:pPr>
+        <w:pStyle w:val="Normal"/>
+        <w:jc w:val="both"/>
+        <w:rPr>
+          <w:rFonts w:ascii="Garamond" w:hAnsi="Garamond"/>
+          <w:sz w:val="36"/>
+          <w:szCs w:val="36"/>
+        </w:rPr>
+      </w:pPr>
+      <w:r>
+        <w:rPr>
+          <w:rFonts w:ascii="Garamond" w:hAnsi="Garamond"/>
+          <w:sz w:val="36"/>
+          <w:szCs w:val="36"/>
+        </w:rPr>
+        <w:t>E dentro dessa interpretação, o "</w:t>
+      </w:r>
+      <w:r>
+        <w:rPr>
+          <w:rFonts w:eastAsia="Arial" w:cs="Arial" w:ascii="Garamond" w:hAnsi="Garamond"/>
+          <w:color w:val="auto"/>
+          <w:kern w:val="0"/>
+          <w:sz w:val="36"/>
+          <w:szCs w:val="36"/>
+          <w:lang w:val="en-US" w:eastAsia="zh-CN" w:bidi="hi-IN"/>
+        </w:rPr>
+        <w:t>amor aos</w:t>
+      </w:r>
+      <w:r>
+        <w:rPr>
+          <w:rFonts w:ascii="Garamond" w:hAnsi="Garamond"/>
+          <w:sz w:val="36"/>
+          <w:szCs w:val="36"/>
+        </w:rPr>
+        <w:t xml:space="preserve"> inimigos" ganha uma outra conotação. </w:t>
+      </w:r>
+    </w:p>
+    <w:p>
+      <w:pPr>
+        <w:pStyle w:val="Normal"/>
+        <w:jc w:val="both"/>
+        <w:rPr>
+          <w:rFonts w:ascii="Garamond" w:hAnsi="Garamond"/>
+          <w:sz w:val="36"/>
+          <w:szCs w:val="36"/>
+        </w:rPr>
+      </w:pPr>
+      <w:r>
+        <w:rPr/>
+      </w:r>
+    </w:p>
+    <w:p>
+      <w:pPr>
+        <w:pStyle w:val="Normal"/>
+        <w:jc w:val="both"/>
+        <w:rPr>
+          <w:rFonts w:ascii="Garamond" w:hAnsi="Garamond"/>
+          <w:sz w:val="36"/>
+          <w:szCs w:val="36"/>
+        </w:rPr>
+      </w:pPr>
+      <w:r>
+        <w:rPr>
+          <w:rFonts w:ascii="Garamond" w:hAnsi="Garamond"/>
+          <w:sz w:val="36"/>
+          <w:szCs w:val="36"/>
+        </w:rPr>
+        <w:t>Precisamos saber lidar com nossas imperfeições com serenidade e equilíbrio.</w:t>
+      </w:r>
+    </w:p>
+    <w:p>
+      <w:pPr>
+        <w:pStyle w:val="Normal"/>
+        <w:jc w:val="both"/>
+        <w:rPr>
+          <w:rFonts w:ascii="Garamond" w:hAnsi="Garamond"/>
+          <w:sz w:val="36"/>
+          <w:szCs w:val="36"/>
+        </w:rPr>
+      </w:pPr>
+      <w:r>
+        <w:rPr>
+          <w:rFonts w:eastAsia="Arial" w:cs="Arial" w:ascii="Garamond" w:hAnsi="Garamond"/>
+          <w:color w:val="auto"/>
+          <w:kern w:val="0"/>
+          <w:sz w:val="36"/>
+          <w:szCs w:val="36"/>
+          <w:lang w:val="en-US" w:eastAsia="zh-CN" w:bidi="hi-IN"/>
+        </w:rPr>
+        <w:t xml:space="preserve">Não se trata de permitir que </w:t>
+      </w:r>
+      <w:r>
+        <w:rPr>
+          <w:rFonts w:ascii="Garamond" w:hAnsi="Garamond"/>
+          <w:sz w:val="36"/>
+          <w:szCs w:val="36"/>
+        </w:rPr>
+        <w:t>essas tendências nos dominem sem fazer nenhum esforço para contê-las, mas, sim, de não alimentarmos rejeição a nós mesmos</w:t>
+      </w:r>
+      <w:r>
+        <w:rPr>
+          <w:rFonts w:eastAsia="Arial" w:cs="Arial" w:ascii="Garamond" w:hAnsi="Garamond"/>
+          <w:color w:val="auto"/>
+          <w:kern w:val="0"/>
+          <w:sz w:val="36"/>
+          <w:szCs w:val="36"/>
+          <w:lang w:val="en-US" w:eastAsia="zh-CN" w:bidi="hi-IN"/>
+        </w:rPr>
+        <w:t xml:space="preserve"> por</w:t>
+      </w:r>
+      <w:r>
+        <w:rPr>
+          <w:rFonts w:ascii="Garamond" w:hAnsi="Garamond"/>
+          <w:sz w:val="36"/>
+          <w:szCs w:val="36"/>
+        </w:rPr>
+        <w:t xml:space="preserve"> aquilo que ainda somos.</w:t>
+      </w:r>
+    </w:p>
+    <w:p>
+      <w:pPr>
+        <w:pStyle w:val="Normal"/>
+        <w:jc w:val="both"/>
+        <w:rPr>
+          <w:rFonts w:ascii="Garamond" w:hAnsi="Garamond"/>
+          <w:sz w:val="36"/>
+          <w:szCs w:val="36"/>
+        </w:rPr>
+      </w:pPr>
+      <w:r>
+        <w:rPr/>
+      </w:r>
+    </w:p>
+    <w:p>
+      <w:pPr>
+        <w:pStyle w:val="Normal"/>
+        <w:jc w:val="both"/>
+        <w:rPr>
+          <w:rFonts w:ascii="Garamond" w:hAnsi="Garamond"/>
+          <w:sz w:val="36"/>
+          <w:szCs w:val="36"/>
+        </w:rPr>
+      </w:pPr>
+      <w:r>
+        <w:rPr>
+          <w:rFonts w:eastAsia="Arial" w:cs="Arial" w:ascii="Garamond" w:hAnsi="Garamond"/>
+          <w:color w:val="auto"/>
+          <w:kern w:val="0"/>
+          <w:sz w:val="36"/>
+          <w:szCs w:val="36"/>
+          <w:lang w:val="en-US" w:eastAsia="zh-CN" w:bidi="hi-IN"/>
+        </w:rPr>
+        <w:t>Quando reconhecemos</w:t>
+      </w:r>
+      <w:r>
+        <w:rPr>
+          <w:rFonts w:ascii="Garamond" w:hAnsi="Garamond"/>
+          <w:sz w:val="36"/>
+          <w:szCs w:val="36"/>
+        </w:rPr>
+        <w:t xml:space="preserve"> com serenidade </w:t>
+      </w:r>
+      <w:r>
+        <w:rPr>
+          <w:rFonts w:eastAsia="Arial" w:cs="Arial" w:ascii="Garamond" w:hAnsi="Garamond"/>
+          <w:color w:val="auto"/>
+          <w:kern w:val="0"/>
+          <w:sz w:val="36"/>
+          <w:szCs w:val="36"/>
+          <w:lang w:val="en-US" w:eastAsia="zh-CN" w:bidi="hi-IN"/>
+        </w:rPr>
+        <w:t>nossas imperfeições,</w:t>
+      </w:r>
+      <w:r>
+        <w:rPr>
+          <w:rFonts w:ascii="Garamond" w:hAnsi="Garamond"/>
+          <w:sz w:val="36"/>
+          <w:szCs w:val="36"/>
+        </w:rPr>
+        <w:t xml:space="preserve"> conseguimos </w:t>
+      </w:r>
+      <w:r>
+        <w:rPr>
+          <w:rFonts w:ascii="Garamond" w:hAnsi="Garamond"/>
+          <w:sz w:val="36"/>
+          <w:szCs w:val="36"/>
+        </w:rPr>
+        <w:t xml:space="preserve">compreender melhor </w:t>
+      </w:r>
+      <w:r>
+        <w:rPr>
+          <w:rFonts w:ascii="Garamond" w:hAnsi="Garamond"/>
+          <w:sz w:val="36"/>
+          <w:szCs w:val="36"/>
+        </w:rPr>
+        <w:t xml:space="preserve">suas causas e trabalhar </w:t>
+      </w:r>
+      <w:r>
+        <w:rPr>
+          <w:rFonts w:eastAsia="Arial" w:cs="Arial" w:ascii="Garamond" w:hAnsi="Garamond"/>
+          <w:color w:val="auto"/>
+          <w:kern w:val="0"/>
+          <w:sz w:val="36"/>
+          <w:szCs w:val="36"/>
+          <w:lang w:val="en-US" w:eastAsia="zh-CN" w:bidi="hi-IN"/>
+        </w:rPr>
+        <w:t>para resolvê-l</w:t>
+      </w:r>
+      <w:r>
+        <w:rPr>
+          <w:rFonts w:eastAsia="Arial" w:cs="Arial" w:ascii="Garamond" w:hAnsi="Garamond"/>
+          <w:color w:val="auto"/>
+          <w:kern w:val="0"/>
+          <w:sz w:val="36"/>
+          <w:szCs w:val="36"/>
+          <w:lang w:val="en-US" w:eastAsia="zh-CN" w:bidi="hi-IN"/>
+        </w:rPr>
+        <w:t>a</w:t>
+      </w:r>
+      <w:r>
+        <w:rPr>
+          <w:rFonts w:eastAsia="Arial" w:cs="Arial" w:ascii="Garamond" w:hAnsi="Garamond"/>
+          <w:color w:val="auto"/>
+          <w:kern w:val="0"/>
+          <w:sz w:val="36"/>
+          <w:szCs w:val="36"/>
+          <w:lang w:val="en-US" w:eastAsia="zh-CN" w:bidi="hi-IN"/>
+        </w:rPr>
+        <w:t>s</w:t>
+      </w:r>
+      <w:r>
+        <w:rPr>
+          <w:rFonts w:ascii="Garamond" w:hAnsi="Garamond"/>
+          <w:sz w:val="36"/>
+          <w:szCs w:val="36"/>
+        </w:rPr>
+        <w:t>.</w:t>
+      </w:r>
+    </w:p>
+    <w:p>
+      <w:pPr>
+        <w:pStyle w:val="Normal"/>
+        <w:jc w:val="both"/>
+        <w:rPr>
+          <w:rFonts w:ascii="Garamond" w:hAnsi="Garamond"/>
+          <w:sz w:val="36"/>
+          <w:szCs w:val="36"/>
+        </w:rPr>
+      </w:pPr>
+      <w:r>
+        <w:rPr/>
+      </w:r>
+    </w:p>
+    <w:p>
+      <w:pPr>
+        <w:pStyle w:val="Normal"/>
+        <w:jc w:val="both"/>
+        <w:rPr>
+          <w:rFonts w:ascii="Garamond" w:hAnsi="Garamond"/>
+          <w:sz w:val="36"/>
+          <w:szCs w:val="36"/>
+        </w:rPr>
+      </w:pPr>
+      <w:r>
+        <w:rPr>
+          <w:rFonts w:ascii="Garamond" w:hAnsi="Garamond"/>
+          <w:sz w:val="36"/>
+          <w:szCs w:val="36"/>
+        </w:rPr>
+        <w:t>Aceitar que ainda somos imperfeitos não significa aceitar a imperfeição como destino.</w:t>
+      </w:r>
+      <w:r>
+        <w:rPr>
+          <w:rFonts w:ascii="Garamond" w:hAnsi="Garamond"/>
+          <w:sz w:val="36"/>
+          <w:szCs w:val="36"/>
+        </w:rPr>
+        <w:t xml:space="preserve"> Não podemos nos apoiar nisso para justificar nossa falta de esforços para nos melhorarmos.</w:t>
+      </w:r>
+    </w:p>
+    <w:p>
+      <w:pPr>
+        <w:pStyle w:val="Normal"/>
+        <w:jc w:val="both"/>
+        <w:rPr>
+          <w:rFonts w:ascii="Garamond" w:hAnsi="Garamond"/>
+          <w:sz w:val="36"/>
+          <w:szCs w:val="36"/>
+        </w:rPr>
+      </w:pPr>
+      <w:r>
+        <w:rPr/>
+      </w:r>
+    </w:p>
+    <w:p>
+      <w:pPr>
+        <w:pStyle w:val="Normal"/>
+        <w:jc w:val="both"/>
+        <w:rPr>
+          <w:rFonts w:ascii="Garamond" w:hAnsi="Garamond"/>
+          <w:sz w:val="36"/>
+          <w:szCs w:val="36"/>
+        </w:rPr>
+      </w:pPr>
+      <w:r>
+        <w:rPr>
+          <w:rFonts w:ascii="Garamond" w:hAnsi="Garamond"/>
+          <w:sz w:val="36"/>
+          <w:szCs w:val="36"/>
+        </w:rPr>
+        <w:t>[</w:t>
+      </w:r>
+      <w:r>
+        <w:rPr>
+          <w:rFonts w:ascii="Garamond" w:hAnsi="Garamond"/>
+          <w:sz w:val="36"/>
+          <w:szCs w:val="36"/>
+        </w:rPr>
+        <w:t xml:space="preserve"> Continuar desse ponto ]</w:t>
+      </w:r>
+    </w:p>
+    <w:p>
+      <w:pPr>
+        <w:pStyle w:val="Normal"/>
+        <w:jc w:val="both"/>
+        <w:rPr>
+          <w:rFonts w:ascii="Garamond" w:hAnsi="Garamond"/>
+          <w:sz w:val="36"/>
+          <w:szCs w:val="36"/>
+        </w:rPr>
+      </w:pPr>
+      <w:r>
+        <w:rPr/>
+      </w:r>
+    </w:p>
+    <w:p>
+      <w:pPr>
+        <w:pStyle w:val="Normal"/>
+        <w:jc w:val="both"/>
+        <w:rPr>
+          <w:rFonts w:ascii="Garamond" w:hAnsi="Garamond"/>
+          <w:sz w:val="36"/>
+          <w:szCs w:val="36"/>
+        </w:rPr>
+      </w:pPr>
+      <w:r>
+        <w:rPr>
+          <w:rFonts w:eastAsia="Arial" w:cs="Arial" w:ascii="Garamond" w:hAnsi="Garamond"/>
+          <w:color w:val="auto"/>
+          <w:kern w:val="0"/>
+          <w:sz w:val="36"/>
+          <w:szCs w:val="36"/>
+          <w:lang w:val="en-US" w:eastAsia="zh-CN" w:bidi="hi-IN"/>
+        </w:rPr>
+        <w:t>Kardec</w:t>
+      </w:r>
+      <w:r>
+        <w:rPr>
+          <w:rFonts w:ascii="Garamond" w:hAnsi="Garamond"/>
+          <w:sz w:val="36"/>
+          <w:szCs w:val="36"/>
+        </w:rPr>
+        <w:t xml:space="preserve"> diz que o homem de bem “estuda suas próprias imperfeições e trabalha incessantemente em combatê-las”. Ou seja, há simultaneamente lucidez sobre aquilo que somos e esforço para aquilo que queremos nos tornar.</w:t>
+      </w:r>
+    </w:p>
+    <w:p>
+      <w:pPr>
+        <w:pStyle w:val="Normal"/>
+        <w:jc w:val="both"/>
+        <w:rPr>
+          <w:rFonts w:ascii="Garamond" w:hAnsi="Garamond"/>
+          <w:sz w:val="36"/>
+          <w:szCs w:val="36"/>
+        </w:rPr>
+      </w:pPr>
+      <w:r>
+        <w:rPr/>
+      </w:r>
+    </w:p>
+    <w:p>
+      <w:pPr>
+        <w:pStyle w:val="Normal"/>
+        <w:jc w:val="both"/>
+        <w:rPr>
+          <w:rFonts w:ascii="Garamond" w:hAnsi="Garamond"/>
+          <w:sz w:val="36"/>
+          <w:szCs w:val="36"/>
+        </w:rPr>
+      </w:pPr>
+      <w:r>
+        <w:rPr>
+          <w:rFonts w:ascii="Garamond" w:hAnsi="Garamond"/>
+          <w:sz w:val="36"/>
+          <w:szCs w:val="36"/>
+        </w:rPr>
+        <w:t>Não precisamos odiar aquilo que ainda precisamos transformar.</w:t>
+      </w:r>
+    </w:p>
+    <w:p>
+      <w:pPr>
+        <w:pStyle w:val="Normal"/>
+        <w:jc w:val="both"/>
+        <w:rPr>
+          <w:rFonts w:ascii="Garamond" w:hAnsi="Garamond"/>
+          <w:sz w:val="36"/>
+          <w:szCs w:val="36"/>
+        </w:rPr>
+      </w:pPr>
+      <w:r>
+        <w:rPr/>
+      </w:r>
+    </w:p>
+    <w:p>
+      <w:pPr>
+        <w:pStyle w:val="Normal"/>
+        <w:jc w:val="both"/>
+        <w:rPr>
+          <w:rFonts w:ascii="Garamond" w:hAnsi="Garamond"/>
+          <w:sz w:val="36"/>
+          <w:szCs w:val="36"/>
+        </w:rPr>
+      </w:pPr>
+      <w:r>
+        <w:rPr>
+          <w:rFonts w:ascii="Garamond" w:hAnsi="Garamond"/>
+          <w:sz w:val="36"/>
+          <w:szCs w:val="36"/>
+        </w:rPr>
+        <w:t>Porque, se eu odeio minha própria imperfeição, posso acabar gastando energia tentando negá-la, escondê-la ou me culpando por possuí-la. Se eu a reconheço com serenidade, posso observá-la. E aquilo que consigo observar, começo a compreender. Aquilo que compreendo, posso começar a modificar.</w:t>
+      </w:r>
+    </w:p>
+    <w:p>
+      <w:pPr>
+        <w:pStyle w:val="Normal"/>
+        <w:jc w:val="both"/>
+        <w:rPr>
+          <w:rFonts w:ascii="Garamond" w:hAnsi="Garamond"/>
+          <w:sz w:val="36"/>
+          <w:szCs w:val="36"/>
+        </w:rPr>
+      </w:pPr>
+      <w:r>
+        <w:rPr/>
+      </w:r>
+    </w:p>
+    <w:p>
+      <w:pPr>
+        <w:pStyle w:val="Normal"/>
+        <w:jc w:val="both"/>
+        <w:rPr>
+          <w:rFonts w:ascii="Garamond" w:hAnsi="Garamond"/>
+          <w:sz w:val="36"/>
+          <w:szCs w:val="36"/>
+        </w:rPr>
+      </w:pPr>
+      <w:r>
+        <w:rPr>
+          <w:rFonts w:ascii="Garamond" w:hAnsi="Garamond"/>
+          <w:sz w:val="36"/>
+          <w:szCs w:val="36"/>
+        </w:rPr>
+        <w:t>Isso também fecha um círculo muito interessante com o que você já desenvolveu sobre amar os inimigos: primeiro você amplia a noção de inimigo — de alguém que está fora para algo que também pode existir dentro de nós — e depois mostra que o amor, inclusive por nós mesmos, não é complacência com o erro; é a disposição de transformar sem ódio, sem vingança e sem desespero.</w:t>
+      </w:r>
+    </w:p>
+    <w:p>
+      <w:pPr>
+        <w:pStyle w:val="Normal"/>
+        <w:jc w:val="both"/>
+        <w:rPr>
+          <w:rFonts w:ascii="Garamond" w:hAnsi="Garamond"/>
+          <w:sz w:val="36"/>
+          <w:szCs w:val="36"/>
+        </w:rPr>
+      </w:pPr>
+      <w:r>
+        <w:rPr>
+          <w:rFonts w:ascii="Garamond" w:hAnsi="Garamond"/>
+          <w:sz w:val="36"/>
+          <w:szCs w:val="36"/>
+        </w:rPr>
+        <w:t>### Os inimigos internos - Término</w:t>
       </w:r>
     </w:p>
     <w:p>
@@ -9468,7 +9752,7 @@
         <w:bCs/>
         <w:rFonts w:ascii="Garamond" w:hAnsi="Garamond"/>
       </w:rPr>
-      <w:t>40</w:t>
+      <w:t>43</w:t>
     </w:r>
     <w:r>
       <w:rPr>

</xml_diff>